<commit_message>
src/build_project_doc.py + .docx: regenerate Word build in same student voice
</commit_message>
<xml_diff>
--- a/docs/PROJECT_EXPLAINED.docx
+++ b/docs/PROJECT_EXPLAINED.docx
@@ -5,31 +5,16 @@
     <w:p>
       <w:pPr>
         <w:keepNext/>
-        <w:spacing w:before="360" w:after="120"/>
+        <w:spacing w:before="320" w:after="80"/>
       </w:pPr>
       <w:r>
         <w:rPr>
           <w:rFonts w:ascii="Calibri" w:hAnsi="Calibri" w:cs="Calibri" w:eastAsia="Calibri"/>
           <w:b/>
           <w:color w:val="1F3B73"/>
-          <w:sz w:val="52"/>
+          <w:sz w:val="48"/>
         </w:rPr>
         <w:t>Ergonomic Risk Factor Prediction</w:t>
-      </w:r>
-    </w:p>
-    <w:p>
-      <w:pPr>
-        <w:spacing w:after="80" w:before="0"/>
-      </w:pPr>
-      <w:r>
-        <w:rPr>
-          <w:rFonts w:ascii="Calibri" w:hAnsi="Calibri" w:cs="Calibri" w:eastAsia="Calibri"/>
-          <w:b w:val="0"/>
-          <w:i/>
-          <w:color w:val="555555"/>
-          <w:sz w:val="28"/>
-        </w:rPr>
-        <w:t>Per-rider risk profiling for food-delivery riders</w:t>
       </w:r>
     </w:p>
     <w:p>
@@ -40,31 +25,31 @@
         <w:rPr>
           <w:rFonts w:ascii="Calibri" w:hAnsi="Calibri" w:cs="Calibri" w:eastAsia="Calibri"/>
           <w:b w:val="0"/>
-          <w:i w:val="0"/>
+          <w:i/>
           <w:color w:val="555555"/>
           <w:sz w:val="22"/>
         </w:rPr>
-        <w:t>A complete project guide</w:t>
+        <w:t>Per-rider risk profiling for food-delivery riders</w:t>
       </w:r>
     </w:p>
     <w:p>
       <w:pPr>
         <w:keepNext/>
-        <w:spacing w:before="360" w:after="120"/>
+        <w:spacing w:before="320" w:after="80"/>
       </w:pPr>
       <w:r>
         <w:rPr>
           <w:rFonts w:ascii="Calibri" w:hAnsi="Calibri" w:cs="Calibri" w:eastAsia="Calibri"/>
           <w:b/>
           <w:color w:val="1F3B73"/>
-          <w:sz w:val="36"/>
+          <w:sz w:val="32"/>
         </w:rPr>
-        <w:t>1. The 30-second pitch</w:t>
+        <w:t>Background</w:t>
       </w:r>
     </w:p>
     <w:p>
       <w:pPr>
-        <w:spacing w:after="120" w:before="0"/>
+        <w:spacing w:after="160" w:before="0"/>
       </w:pPr>
       <w:r>
         <w:rPr>
@@ -74,12 +59,12 @@
           <w:color w:val="222222"/>
           <w:sz w:val="22"/>
         </w:rPr>
-        <w:t>Food-delivery riders (Blinkit, Zepto, etc.) do physically demanding work that, over time, can cause musculoskeletal disorders (MSDs) — back pain, shoulder pain, wrist injuries, and so on. This project builds a tool that takes a rider profile (demographics, work pattern, vehicle, carrying mode, NMQ pain self-report, NASA-TLX workload, Borg CR10 fatigue, and RULA + QEC ergonomic observations) and predicts six ergonomic risk factors — Force, Repetition, Posture, Duration, Contact Stress, Vibration — each as Low / Medium / High.</w:t>
+        <w:t>Food-delivery riders for platforms like Blinkit and Zepto spend long hours on bikes, climb stairs, carry packages, and ride in heavy traffic. Over time this kind of work causes musculoskeletal disorders (MSDs): back pain, shoulder pain, wrist injuries, knee problems. The risk is not the same for every rider. Someone who is 22 and works 4 hours a day on a scooter is in a very different situation from a 45-year-old who works 10 hours a day on a motorbike with a handheld bag.</w:t>
       </w:r>
     </w:p>
     <w:p>
       <w:pPr>
-        <w:spacing w:after="120" w:before="0"/>
+        <w:spacing w:after="160" w:before="0"/>
       </w:pPr>
       <w:r>
         <w:rPr>
@@ -89,27 +74,27 @@
           <w:color w:val="222222"/>
           <w:sz w:val="22"/>
         </w:rPr>
-        <w:t>The end product is a Streamlit web app that accepts the full 36-question survey plus the 11 RULA components and 8 QEC scores, runs six trained scikit-learn / XGBoost / imbalanced-learn classifiers, and returns colour-coded per-factor risk levels in real time.</w:t>
+        <w:t>Ergonomists have standard ways of measuring this kind of strain: RULA (Rapid Upper Limb Assessment) scores the posture of a worker's upper body; QEC (Quick Exposure Check) gives a composite of body-region and exposure scores; the Nordic Musculoskeletal Questionnaire (NMQ) records pain across 9 body areas; NASA-TLX rates the mental workload of a task; Borg CR10 records perceived physical effort on a 0 to 10 scale. Each of these gives useful information on its own. The project takes all of them together and produces a single per-rider risk profile across six ergonomic dimensions: Force, Repetition, Posture, Duration, Contact Stress, Vibration.</w:t>
       </w:r>
     </w:p>
     <w:p>
       <w:pPr>
         <w:keepNext/>
-        <w:spacing w:before="360" w:after="120"/>
+        <w:spacing w:before="320" w:after="80"/>
       </w:pPr>
       <w:r>
         <w:rPr>
           <w:rFonts w:ascii="Calibri" w:hAnsi="Calibri" w:cs="Calibri" w:eastAsia="Calibri"/>
           <w:b/>
           <w:color w:val="1F3B73"/>
-          <w:sz w:val="36"/>
+          <w:sz w:val="32"/>
         </w:rPr>
-        <w:t>2. The problem we set out to solve</w:t>
+        <w:t>What the project does</w:t>
       </w:r>
     </w:p>
     <w:p>
       <w:pPr>
-        <w:spacing w:after="120" w:before="0"/>
+        <w:spacing w:after="160" w:before="0"/>
       </w:pPr>
       <w:r>
         <w:rPr>
@@ -119,12 +104,12 @@
           <w:color w:val="222222"/>
           <w:sz w:val="22"/>
         </w:rPr>
-        <w:t>Established ergonomic assessment methods exist — RULA (Rapid Upper Limb Assessment), QEC (Quick Exposure Check), Nordic Musculoskeletal Questionnaire (NMQ), NASA-TLX, Borg CR10 — but each produces a different score and each requires an expert to interpret. No single, unified, automated tool produced a per-rider multi-factor risk profile that a delivery platform could act on operationally.</w:t>
+        <w:t>We collected survey responses from 182 riders along with 182 RULA and QEC observation records. The pipeline cleans this data, applies standard ergonomic thresholds to compute Low / Medium / High labels for each of the six risk factors, then trains a separate classifier per factor so a new rider's profile can be screened automatically. The output is wired into a Streamlit web app where someone can fill in the rider's questionnaire (plus optional RULA and QEC scores), click Predict, and read six coloured risk levels.</w:t>
       </w:r>
     </w:p>
     <w:p>
       <w:pPr>
-        <w:spacing w:after="120" w:before="0"/>
+        <w:spacing w:after="160" w:before="0"/>
       </w:pPr>
       <w:r>
         <w:rPr>
@@ -134,127 +119,7 @@
           <w:color w:val="222222"/>
           <w:sz w:val="22"/>
         </w:rPr>
-        <w:t>We built that pipeline end-to-end: from raw CSV + XLSX inputs, through Stage-1 deterministic risk scoring, to Stage-2 supervised classification, to an interactive demo and a presentation-ready deck.</w:t>
-      </w:r>
-    </w:p>
-    <w:p>
-      <w:pPr>
-        <w:keepNext/>
-        <w:spacing w:before="360" w:after="120"/>
-      </w:pPr>
-      <w:r>
-        <w:rPr>
-          <w:rFonts w:ascii="Calibri" w:hAnsi="Calibri" w:cs="Calibri" w:eastAsia="Calibri"/>
-          <w:b/>
-          <w:color w:val="1F3B73"/>
-          <w:sz w:val="36"/>
-        </w:rPr>
-        <w:t>3. What we actually built</w:t>
-      </w:r>
-    </w:p>
-    <w:p>
-      <w:pPr>
-        <w:keepNext/>
-        <w:spacing w:before="240" w:after="120"/>
-      </w:pPr>
-      <w:r>
-        <w:rPr>
-          <w:rFonts w:ascii="Calibri" w:hAnsi="Calibri" w:cs="Calibri" w:eastAsia="Calibri"/>
-          <w:b/>
-          <w:color w:val="2E86AB"/>
-          <w:sz w:val="28"/>
-        </w:rPr>
-        <w:t>a) A reproducible data-analysis pipeline</w:t>
-      </w:r>
-    </w:p>
-    <w:p>
-      <w:pPr>
-        <w:spacing w:after="120" w:before="0"/>
-      </w:pPr>
-      <w:r>
-        <w:rPr>
-          <w:rFonts w:ascii="Calibri" w:hAnsi="Calibri" w:cs="Calibri" w:eastAsia="Calibri"/>
-          <w:b w:val="0"/>
-          <w:i w:val="0"/>
-          <w:color w:val="222222"/>
-          <w:sz w:val="22"/>
-        </w:rPr>
-        <w:t>Seven Jupyter notebooks (notebooks/01_data_cleaning.ipynb through 07_evaluation.ipynb) that run in order and produce every figure, table, and saved model.</w:t>
-      </w:r>
-    </w:p>
-    <w:p>
-      <w:pPr>
-        <w:keepNext/>
-        <w:spacing w:before="240" w:after="120"/>
-      </w:pPr>
-      <w:r>
-        <w:rPr>
-          <w:rFonts w:ascii="Calibri" w:hAnsi="Calibri" w:cs="Calibri" w:eastAsia="Calibri"/>
-          <w:b/>
-          <w:color w:val="2E86AB"/>
-          <w:sz w:val="28"/>
-        </w:rPr>
-        <w:t>b) Six trained classifiers</w:t>
-      </w:r>
-    </w:p>
-    <w:p>
-      <w:pPr>
-        <w:spacing w:after="120" w:before="0"/>
-      </w:pPr>
-      <w:r>
-        <w:rPr>
-          <w:rFonts w:ascii="Calibri" w:hAnsi="Calibri" w:cs="Calibri" w:eastAsia="Calibri"/>
-          <w:b w:val="0"/>
-          <w:i w:val="0"/>
-          <w:color w:val="222222"/>
-          <w:sz w:val="22"/>
-        </w:rPr>
-        <w:t>One scikit-learn / XGBoost / imbalanced-learn model per risk factor, saved as joblib pickles at outputs/models/best_&lt;factor&gt;.pkl. The Posture model is trained on the full 44 survey features plus 11 RULA components and 8 QEC scores (63 features total); the other 5 are trained on 41–42 survey features only.</w:t>
-      </w:r>
-    </w:p>
-    <w:p>
-      <w:pPr>
-        <w:keepNext/>
-        <w:spacing w:before="240" w:after="120"/>
-      </w:pPr>
-      <w:r>
-        <w:rPr>
-          <w:rFonts w:ascii="Calibri" w:hAnsi="Calibri" w:cs="Calibri" w:eastAsia="Calibri"/>
-          <w:b/>
-          <w:color w:val="2E86AB"/>
-          <w:sz w:val="28"/>
-        </w:rPr>
-        <w:t>c) The Streamlit web application</w:t>
-      </w:r>
-    </w:p>
-    <w:p>
-      <w:pPr>
-        <w:spacing w:after="120" w:before="0"/>
-      </w:pPr>
-      <w:r>
-        <w:rPr>
-          <w:rFonts w:ascii="Calibri" w:hAnsi="Calibri" w:cs="Calibri" w:eastAsia="Calibri"/>
-          <w:b w:val="0"/>
-          <w:i w:val="0"/>
-          <w:color w:val="222222"/>
-          <w:sz w:val="22"/>
-        </w:rPr>
-        <w:t>app/streamlit_app.py — a six-section form that mirrors the entire 36-question questionnaire plus the RULA + QEC observation worksheets. The encode_rider() function converts form answers into the feature vector each model expects, and predict_risks() returns the Low/Medium/High level per factor.</w:t>
-      </w:r>
-    </w:p>
-    <w:p>
-      <w:pPr>
-        <w:keepNext/>
-        <w:spacing w:before="240" w:after="120"/>
-      </w:pPr>
-      <w:r>
-        <w:rPr>
-          <w:rFonts w:ascii="Calibri" w:hAnsi="Calibri" w:cs="Calibri" w:eastAsia="Calibri"/>
-          <w:b/>
-          <w:color w:val="2E86AB"/>
-          <w:sz w:val="28"/>
-        </w:rPr>
-        <w:t>d) Mentor-facing outputs</w:t>
+        <w:t>The work is split across seven Jupyter notebooks:</w:t>
       </w:r>
     </w:p>
     <w:p>
@@ -265,9 +130,10 @@
       <w:r>
         <w:rPr>
           <w:rFonts w:ascii="Calibri" w:hAnsi="Calibri" w:cs="Calibri" w:eastAsia="Calibri"/>
+          <w:color w:val="222222"/>
           <w:sz w:val="22"/>
         </w:rPr>
-        <w:t>WITH_RESULTS.pptx — 53-slide deck with Phase 4–7 figures and text slides</w:t>
+        <w:t>01_data_cleaning - normalise the raw CSV and validate</w:t>
       </w:r>
     </w:p>
     <w:p>
@@ -278,9 +144,10 @@
       <w:r>
         <w:rPr>
           <w:rFonts w:ascii="Calibri" w:hAnsi="Calibri" w:cs="Calibri" w:eastAsia="Calibri"/>
+          <w:color w:val="222222"/>
           <w:sz w:val="22"/>
         </w:rPr>
-        <w:t>docs/results.md — full mentor write-up with all numbers and benchmarks</w:t>
+        <w:t>02_feature_engineering - encode categoricals, derive composite scores, merge the posture observations into the survey by severity rank</w:t>
       </w:r>
     </w:p>
     <w:p>
@@ -291,249 +158,10 @@
       <w:r>
         <w:rPr>
           <w:rFonts w:ascii="Calibri" w:hAnsi="Calibri" w:cs="Calibri" w:eastAsia="Calibri"/>
-          <w:sz w:val="22"/>
-        </w:rPr>
-        <w:t>docs/PROJECT_EXPLAINED.md / .docx — this complete guide</w:t>
-      </w:r>
-    </w:p>
-    <w:p>
-      <w:pPr>
-        <w:keepNext/>
-        <w:spacing w:before="360" w:after="120"/>
-      </w:pPr>
-      <w:r>
-        <w:rPr>
-          <w:rFonts w:ascii="Calibri" w:hAnsi="Calibri" w:cs="Calibri" w:eastAsia="Calibri"/>
-          <w:b/>
-          <w:color w:val="1F3B73"/>
-          <w:sz w:val="36"/>
-        </w:rPr>
-        <w:t>4. The six ergonomic risk factors</w:t>
-      </w:r>
-    </w:p>
-    <w:p>
-      <w:pPr>
-        <w:spacing w:after="120" w:before="0"/>
-      </w:pPr>
-      <w:r>
-        <w:rPr>
-          <w:rFonts w:ascii="Calibri" w:hAnsi="Calibri" w:cs="Calibri" w:eastAsia="Calibri"/>
-          <w:b w:val="0"/>
-          <w:i w:val="0"/>
           <w:color w:val="222222"/>
           <w:sz w:val="22"/>
         </w:rPr>
-        <w:t>Each factor is scored from standard ergonomic thresholds:</w:t>
-      </w:r>
-    </w:p>
-    <w:p>
-      <w:pPr>
-        <w:keepNext/>
-        <w:spacing w:before="240" w:after="120"/>
-      </w:pPr>
-      <w:r>
-        <w:rPr>
-          <w:rFonts w:ascii="Calibri" w:hAnsi="Calibri" w:cs="Calibri" w:eastAsia="Calibri"/>
-          <w:b/>
-          <w:color w:val="2E86AB"/>
-          <w:sz w:val="28"/>
-        </w:rPr>
-        <w:t>Force</w:t>
-      </w:r>
-    </w:p>
-    <w:p>
-      <w:pPr>
-        <w:spacing w:after="120" w:before="0"/>
-      </w:pPr>
-      <w:r>
-        <w:rPr>
-          <w:rFonts w:ascii="Calibri" w:hAnsi="Calibri" w:cs="Calibri" w:eastAsia="Calibri"/>
-          <w:b w:val="0"/>
-          <w:i w:val="0"/>
-          <w:color w:val="222222"/>
-          <w:sz w:val="22"/>
-        </w:rPr>
-        <w:t>Lifting / carrying exertion derived from the Borg CR10 'lifting' item. Standard Borg action levels: 0–3 = Low (acceptable), 4–6 = Medium (monitor), 7–10 = High (intervene).</w:t>
-      </w:r>
-    </w:p>
-    <w:p>
-      <w:pPr>
-        <w:keepNext/>
-        <w:spacing w:before="240" w:after="120"/>
-      </w:pPr>
-      <w:r>
-        <w:rPr>
-          <w:rFonts w:ascii="Calibri" w:hAnsi="Calibri" w:cs="Calibri" w:eastAsia="Calibri"/>
-          <w:b/>
-          <w:color w:val="2E86AB"/>
-          <w:sz w:val="28"/>
-        </w:rPr>
-        <w:t>Repetition</w:t>
-      </w:r>
-    </w:p>
-    <w:p>
-      <w:pPr>
-        <w:spacing w:after="120" w:before="0"/>
-      </w:pPr>
-      <w:r>
-        <w:rPr>
-          <w:rFonts w:ascii="Calibri" w:hAnsi="Calibri" w:cs="Calibri" w:eastAsia="Calibri"/>
-          <w:b w:val="0"/>
-          <w:i w:val="0"/>
-          <w:color w:val="222222"/>
-          <w:sz w:val="22"/>
-        </w:rPr>
-        <w:t>Deliveries per hour = deliveries_num / work_hours_num. After a Phase 3 binning fix (see §9), the cut-offs are fixed at: ≤2.5 = Low, 2.5–3.75 = Medium, ≥3.75 = High.</w:t>
-      </w:r>
-    </w:p>
-    <w:p>
-      <w:pPr>
-        <w:keepNext/>
-        <w:spacing w:before="240" w:after="120"/>
-      </w:pPr>
-      <w:r>
-        <w:rPr>
-          <w:rFonts w:ascii="Calibri" w:hAnsi="Calibri" w:cs="Calibri" w:eastAsia="Calibri"/>
-          <w:b/>
-          <w:color w:val="2E86AB"/>
-          <w:sz w:val="28"/>
-        </w:rPr>
-        <w:t>Posture</w:t>
-      </w:r>
-    </w:p>
-    <w:p>
-      <w:pPr>
-        <w:spacing w:after="120" w:before="0"/>
-      </w:pPr>
-      <w:r>
-        <w:rPr>
-          <w:rFonts w:ascii="Calibri" w:hAnsi="Calibri" w:cs="Calibri" w:eastAsia="Calibri"/>
-          <w:b w:val="0"/>
-          <w:i w:val="0"/>
-          <w:color w:val="222222"/>
-          <w:sz w:val="22"/>
-        </w:rPr>
-        <w:t>RULA Table C score. Standard RULA action levels: 1–2 = Low (acceptable), 3–4 = Medium (investigate), 5+ = High (change immediately).</w:t>
-      </w:r>
-    </w:p>
-    <w:p>
-      <w:pPr>
-        <w:keepNext/>
-        <w:spacing w:before="240" w:after="120"/>
-      </w:pPr>
-      <w:r>
-        <w:rPr>
-          <w:rFonts w:ascii="Calibri" w:hAnsi="Calibri" w:cs="Calibri" w:eastAsia="Calibri"/>
-          <w:b/>
-          <w:color w:val="2E86AB"/>
-          <w:sz w:val="28"/>
-        </w:rPr>
-        <w:t>Duration</w:t>
-      </w:r>
-    </w:p>
-    <w:p>
-      <w:pPr>
-        <w:spacing w:after="120" w:before="0"/>
-      </w:pPr>
-      <w:r>
-        <w:rPr>
-          <w:rFonts w:ascii="Calibri" w:hAnsi="Calibri" w:cs="Calibri" w:eastAsia="Calibri"/>
-          <w:b w:val="0"/>
-          <w:i w:val="0"/>
-          <w:color w:val="222222"/>
-          <w:sz w:val="22"/>
-        </w:rPr>
-        <w:t>Continuous riding hours. ≤5 hrs = Low, 6–7 hrs = Medium, &gt;7 hrs = High.</w:t>
-      </w:r>
-    </w:p>
-    <w:p>
-      <w:pPr>
-        <w:keepNext/>
-        <w:spacing w:before="240" w:after="120"/>
-      </w:pPr>
-      <w:r>
-        <w:rPr>
-          <w:rFonts w:ascii="Calibri" w:hAnsi="Calibri" w:cs="Calibri" w:eastAsia="Calibri"/>
-          <w:b/>
-          <w:color w:val="2E86AB"/>
-          <w:sz w:val="28"/>
-        </w:rPr>
-        <w:t>Contact Stress</w:t>
-      </w:r>
-    </w:p>
-    <w:p>
-      <w:pPr>
-        <w:spacing w:after="120" w:before="0"/>
-      </w:pPr>
-      <w:r>
-        <w:rPr>
-          <w:rFonts w:ascii="Calibri" w:hAnsi="Calibri" w:cs="Calibri" w:eastAsia="Calibri"/>
-          <w:b w:val="0"/>
-          <w:i w:val="0"/>
-          <w:color w:val="222222"/>
-          <w:sz w:val="22"/>
-        </w:rPr>
-        <w:t>Composite of carrying_contact_rank × work_hours_num × (1 + 0.1 × age_ord). Binned by sample tercile into Low / Medium / High.</w:t>
-      </w:r>
-    </w:p>
-    <w:p>
-      <w:pPr>
-        <w:keepNext/>
-        <w:spacing w:before="240" w:after="120"/>
-      </w:pPr>
-      <w:r>
-        <w:rPr>
-          <w:rFonts w:ascii="Calibri" w:hAnsi="Calibri" w:cs="Calibri" w:eastAsia="Calibri"/>
-          <w:b/>
-          <w:color w:val="2E86AB"/>
-          <w:sz w:val="28"/>
-        </w:rPr>
-        <w:t>Vibration</w:t>
-      </w:r>
-    </w:p>
-    <w:p>
-      <w:pPr>
-        <w:spacing w:after="120" w:before="0"/>
-      </w:pPr>
-      <w:r>
-        <w:rPr>
-          <w:rFonts w:ascii="Calibri" w:hAnsi="Calibri" w:cs="Calibri" w:eastAsia="Calibri"/>
-          <w:b w:val="0"/>
-          <w:i w:val="0"/>
-          <w:color w:val="222222"/>
-          <w:sz w:val="22"/>
-        </w:rPr>
-        <w:t>vibration_index = vehicle_rank × work_hours_num (scooter = 1, motor bike = 2). Binned by sample tercile. A proxy because we did not have ISO-2631 accelerometer data per rider.</w:t>
-      </w:r>
-    </w:p>
-    <w:p>
-      <w:pPr>
-        <w:keepNext/>
-        <w:spacing w:before="360" w:after="120"/>
-      </w:pPr>
-      <w:r>
-        <w:rPr>
-          <w:rFonts w:ascii="Calibri" w:hAnsi="Calibri" w:cs="Calibri" w:eastAsia="Calibri"/>
-          <w:b/>
-          <w:color w:val="1F3B73"/>
-          <w:sz w:val="36"/>
-        </w:rPr>
-        <w:t>5. Data sources</w:t>
-      </w:r>
-    </w:p>
-    <w:p>
-      <w:pPr>
-        <w:keepNext/>
-        <w:spacing w:before="240" w:after="120"/>
-      </w:pPr>
-      <w:r>
-        <w:rPr>
-          <w:rFonts w:ascii="Calibri" w:hAnsi="Calibri" w:cs="Calibri" w:eastAsia="Calibri"/>
-          <w:b/>
-          <w:color w:val="2E86AB"/>
-          <w:sz w:val="28"/>
-        </w:rPr>
-        <w:t>delivery_rider_survey.csv (182 riders, 48 columns)</w:t>
+        <w:t>03_risk_scoring - apply standard thresholds to compute the six Low/Medium/High labels per rider</w:t>
       </w:r>
     </w:p>
     <w:p>
@@ -544,9 +172,10 @@
       <w:r>
         <w:rPr>
           <w:rFonts w:ascii="Calibri" w:hAnsi="Calibri" w:cs="Calibri" w:eastAsia="Calibri"/>
+          <w:color w:val="222222"/>
           <w:sz w:val="22"/>
         </w:rPr>
-        <w:t>Q1–17: Demographic, lifestyle, work pattern (Gender, Age, Education, Region, Marital status, Delivery platform, Job duration, Monthly income, Type of vehicle, Mode of carrying deliveries, Working hours/day, Working days/week, Deliveries/day, Rest break, Type of break, Tobacco, Alcohol)</w:t>
+        <w:t>04_eda - figures: demographics, NMQ prevalence, risk distribution, discomfort by group, correlation heatmap</w:t>
       </w:r>
     </w:p>
     <w:p>
@@ -557,9 +186,10 @@
       <w:r>
         <w:rPr>
           <w:rFonts w:ascii="Calibri" w:hAnsi="Calibri" w:cs="Calibri" w:eastAsia="Calibri"/>
+          <w:color w:val="222222"/>
           <w:sz w:val="22"/>
         </w:rPr>
-        <w:t>Q18: Nordic Musculoskeletal Questionnaire — 12-month pain in 9 body areas (neck, shoulders, upper back, lower back, elbows, wrists/hands, hips/thighs, knees, ankles/feet)</w:t>
+        <w:t>05_stats - chi-square and logistic regression</w:t>
       </w:r>
     </w:p>
     <w:p>
@@ -570,9 +200,10 @@
       <w:r>
         <w:rPr>
           <w:rFonts w:ascii="Calibri" w:hAnsi="Calibri" w:cs="Calibri" w:eastAsia="Calibri"/>
+          <w:color w:val="222222"/>
           <w:sz w:val="22"/>
         </w:rPr>
-        <w:t>Q19: 7-day discomfort in 4 areas</w:t>
+        <w:t>06_modeling - SMOTE + GridSearchCV across 7 algorithms per target, keep the best by F1 macro</w:t>
       </w:r>
     </w:p>
     <w:p>
@@ -583,158 +214,15 @@
       <w:r>
         <w:rPr>
           <w:rFonts w:ascii="Calibri" w:hAnsi="Calibri" w:cs="Calibri" w:eastAsia="Calibri"/>
+          <w:color w:val="222222"/>
           <w:sz w:val="22"/>
         </w:rPr>
-        <w:t>Q20–24: Discomfort follow-ups (reduced performance, taken leave, consulted doctor, riding worsens, carrying worsens)</w:t>
+        <w:t>07_evaluation - confusion matrices, ROC curves, feature importance</w:t>
       </w:r>
     </w:p>
     <w:p>
       <w:pPr>
-        <w:pStyle w:val="ListBullet"/>
-        <w:spacing w:after="40"/>
-      </w:pPr>
-      <w:r>
-        <w:rPr>
-          <w:rFonts w:ascii="Calibri" w:hAnsi="Calibri" w:cs="Calibri" w:eastAsia="Calibri"/>
-          <w:sz w:val="22"/>
-        </w:rPr>
-        <w:t>Q25–30: NASA-TLX workload (mental demand, physical demand, time pressure, satisfaction, effort, frustration; 0–100 each)</w:t>
-      </w:r>
-    </w:p>
-    <w:p>
-      <w:pPr>
-        <w:pStyle w:val="ListBullet"/>
-        <w:spacing w:after="40"/>
-      </w:pPr>
-      <w:r>
-        <w:rPr>
-          <w:rFonts w:ascii="Calibri" w:hAnsi="Calibri" w:cs="Calibri" w:eastAsia="Calibri"/>
-          <w:sz w:val="22"/>
-        </w:rPr>
-        <w:t>Q31–36: Borg CR10 fatigue (overall, legs, breathing, lifting, traffic, exhaustion; 0–10 each)</w:t>
-      </w:r>
-    </w:p>
-    <w:p>
-      <w:pPr>
-        <w:keepNext/>
-        <w:spacing w:before="240" w:after="120"/>
-      </w:pPr>
-      <w:r>
-        <w:rPr>
-          <w:rFonts w:ascii="Calibri" w:hAnsi="Calibri" w:cs="Calibri" w:eastAsia="Calibri"/>
-          <w:b/>
-          <w:color w:val="2E86AB"/>
-          <w:sz w:val="28"/>
-        </w:rPr>
-        <w:t>posture_data.xlsx (182 observations, 26 columns per sheet)</w:t>
-      </w:r>
-    </w:p>
-    <w:p>
-      <w:pPr>
-        <w:pStyle w:val="ListBullet"/>
-        <w:spacing w:after="40"/>
-      </w:pPr>
-      <w:r>
-        <w:rPr>
-          <w:rFonts w:ascii="Calibri" w:hAnsi="Calibri" w:cs="Calibri" w:eastAsia="Calibri"/>
-          <w:sz w:val="22"/>
-        </w:rPr>
-        <w:t>11 RULA components: upper_arm, lower_arm, wrist, wrist_twist, neck_position, trunk_position, legs, muscle_a, force_a, muscle_b, force_b</w:t>
-      </w:r>
-    </w:p>
-    <w:p>
-      <w:pPr>
-        <w:pStyle w:val="ListBullet"/>
-        <w:spacing w:after="40"/>
-      </w:pPr>
-      <w:r>
-        <w:rPr>
-          <w:rFonts w:ascii="Calibri" w:hAnsi="Calibri" w:cs="Calibri" w:eastAsia="Calibri"/>
-          <w:sz w:val="22"/>
-        </w:rPr>
-        <w:t>3 derived RULA scores: rula_table_a, rula_table_b, rula_table_c (excluded from features as direct leakage on posture_risk)</w:t>
-      </w:r>
-    </w:p>
-    <w:p>
-      <w:pPr>
-        <w:pStyle w:val="ListBullet"/>
-        <w:spacing w:after="40"/>
-      </w:pPr>
-      <w:r>
-        <w:rPr>
-          <w:rFonts w:ascii="Calibri" w:hAnsi="Calibri" w:cs="Calibri" w:eastAsia="Calibri"/>
-          <w:sz w:val="22"/>
-        </w:rPr>
-        <w:t>8 QEC scores: qec_back, qec_shoulder_arm, qec_wrist_hand, qec_neck, qec_driving, qec_vibration, qec_work_pace, qec_stress</w:t>
-      </w:r>
-    </w:p>
-    <w:p>
-      <w:pPr>
-        <w:spacing w:after="120" w:before="0"/>
-      </w:pPr>
-      <w:r>
-        <w:rPr>
-          <w:rFonts w:ascii="Calibri" w:hAnsi="Calibri" w:cs="Calibri" w:eastAsia="Calibri"/>
-          <w:b w:val="0"/>
-          <w:i/>
-          <w:color w:val="555555"/>
-          <w:sz w:val="22"/>
-        </w:rPr>
-        <w:t>The observations did not carry a rider identifier. Pairing to the survey was done via a severity-rank merge in Phase 2, Step 8 (see §9 Limitations).</w:t>
-      </w:r>
-    </w:p>
-    <w:p>
-      <w:pPr>
-        <w:keepNext/>
-        <w:spacing w:before="360" w:after="120"/>
-      </w:pPr>
-      <w:r>
-        <w:rPr>
-          <w:rFonts w:ascii="Calibri" w:hAnsi="Calibri" w:cs="Calibri" w:eastAsia="Calibri"/>
-          <w:b/>
-          <w:color w:val="1F3B73"/>
-          <w:sz w:val="36"/>
-        </w:rPr>
-        <w:t>6. The nine-phase journey</w:t>
-      </w:r>
-    </w:p>
-    <w:p>
-      <w:pPr>
-        <w:keepNext/>
-        <w:spacing w:before="240" w:after="120"/>
-      </w:pPr>
-      <w:r>
-        <w:rPr>
-          <w:rFonts w:ascii="Calibri" w:hAnsi="Calibri" w:cs="Calibri" w:eastAsia="Calibri"/>
-          <w:b/>
-          <w:color w:val="2E86AB"/>
-          <w:sz w:val="28"/>
-        </w:rPr>
-        <w:t>Phase 1 — Data Cleaning</w:t>
-      </w:r>
-    </w:p>
-    <w:p>
-      <w:pPr>
-        <w:spacing w:after="120"/>
-      </w:pPr>
-      <w:r>
-        <w:rPr>
-          <w:rFonts w:ascii="Consolas" w:hAnsi="Consolas" w:cs="Consolas" w:eastAsia="Consolas"/>
-          <w:color w:val="555555"/>
-          <w:sz w:val="20"/>
-        </w:rPr>
-        <w:t>notebooks/01_data_cleaning.ipynb</w:t>
-      </w:r>
-      <w:r>
-        <w:rPr>
-          <w:rFonts w:ascii="Calibri" w:hAnsi="Calibri" w:cs="Calibri" w:eastAsia="Calibri"/>
-          <w:sz w:val="20"/>
-        </w:rPr>
-      </w:r>
-    </w:p>
-    <w:p>
-      <w:pPr>
-        <w:spacing w:after="120" w:before="0"/>
+        <w:spacing w:after="160" w:before="0"/>
       </w:pPr>
       <w:r>
         <w:rPr>
@@ -744,46 +232,27 @@
           <w:color w:val="222222"/>
           <w:sz w:val="22"/>
         </w:rPr>
-        <w:t>Strips empty rows, normalises column names, standardises Yes/No, validates 182 rows × 48 columns. Output: data/processed/cleaned.csv.</w:t>
+        <w:t>Two helper scripts produce the polished outputs. src/build_results_deck.py appends the Phase 4 to 7 figures and result tables onto the original presentation deck. src/build_project_doc.py (this script) builds the Word version of the project write-up.</w:t>
       </w:r>
     </w:p>
     <w:p>
       <w:pPr>
         <w:keepNext/>
-        <w:spacing w:before="240" w:after="120"/>
+        <w:spacing w:before="320" w:after="80"/>
       </w:pPr>
       <w:r>
         <w:rPr>
           <w:rFonts w:ascii="Calibri" w:hAnsi="Calibri" w:cs="Calibri" w:eastAsia="Calibri"/>
           <w:b/>
-          <w:color w:val="2E86AB"/>
-          <w:sz w:val="28"/>
+          <w:color w:val="1F3B73"/>
+          <w:sz w:val="32"/>
         </w:rPr>
-        <w:t>Phase 2 — Feature Engineering</w:t>
+        <w:t>The six risk factors</w:t>
       </w:r>
     </w:p>
     <w:p>
       <w:pPr>
-        <w:spacing w:after="120"/>
-      </w:pPr>
-      <w:r>
-        <w:rPr>
-          <w:rFonts w:ascii="Consolas" w:hAnsi="Consolas" w:cs="Consolas" w:eastAsia="Consolas"/>
-          <w:color w:val="555555"/>
-          <w:sz w:val="20"/>
-        </w:rPr>
-        <w:t>notebooks/02_feature_engineering.ipynb</w:t>
-      </w:r>
-      <w:r>
-        <w:rPr>
-          <w:rFonts w:ascii="Calibri" w:hAnsi="Calibri" w:cs="Calibri" w:eastAsia="Calibri"/>
-          <w:sz w:val="20"/>
-        </w:rPr>
-      </w:r>
-    </w:p>
-    <w:p>
-      <w:pPr>
-        <w:spacing w:after="120" w:before="0"/>
+        <w:spacing w:after="160" w:before="0"/>
       </w:pPr>
       <w:r>
         <w:rPr>
@@ -793,46 +262,27 @@
           <w:color w:val="222222"/>
           <w:sz w:val="22"/>
         </w:rPr>
-        <w:t>Ordinal-encodes binned categoricals (age_ord, income_ord, etc.), assigns numeric midpoints (work_hours_num, deliveries_num, etc.), binarises Yes/No items, ranks vehicle and carrying mode, derives composite scores (workload_score, fatigue_score, force_exertion, vibration_index), creates 5 interaction features, encodes 7 additional demographic categoricals (gender_rank, region_rank, marital_rank, platform_rank, break_type_rank, tobacco_ord, alcohol_ord), aliases 18 binary survey items with short names (nmq_*, d7_*, out_*), and merges the posture_data.xlsx via severity rank. Output: data/processed/model_ready.csv (121 columns).</w:t>
+        <w:t>Each factor is computed in Phase 3 using a standard ergonomic method and binned into Low, Medium, or High.</w:t>
       </w:r>
     </w:p>
     <w:p>
       <w:pPr>
         <w:keepNext/>
-        <w:spacing w:before="240" w:after="120"/>
+        <w:spacing w:before="200" w:after="80"/>
       </w:pPr>
       <w:r>
         <w:rPr>
           <w:rFonts w:ascii="Calibri" w:hAnsi="Calibri" w:cs="Calibri" w:eastAsia="Calibri"/>
           <w:b/>
           <w:color w:val="2E86AB"/>
-          <w:sz w:val="28"/>
+          <w:sz w:val="26"/>
         </w:rPr>
-        <w:t>Phase 3 — Risk Scoring</w:t>
+        <w:t>Force</w:t>
       </w:r>
     </w:p>
     <w:p>
       <w:pPr>
-        <w:spacing w:after="120"/>
-      </w:pPr>
-      <w:r>
-        <w:rPr>
-          <w:rFonts w:ascii="Consolas" w:hAnsi="Consolas" w:cs="Consolas" w:eastAsia="Consolas"/>
-          <w:color w:val="555555"/>
-          <w:sz w:val="20"/>
-        </w:rPr>
-        <w:t>notebooks/03_risk_scoring.ipynb</w:t>
-      </w:r>
-      <w:r>
-        <w:rPr>
-          <w:rFonts w:ascii="Calibri" w:hAnsi="Calibri" w:cs="Calibri" w:eastAsia="Calibri"/>
-          <w:sz w:val="20"/>
-        </w:rPr>
-      </w:r>
-    </w:p>
-    <w:p>
-      <w:pPr>
-        <w:spacing w:after="120" w:before="0"/>
+        <w:spacing w:after="160" w:before="0"/>
       </w:pPr>
       <w:r>
         <w:rPr>
@@ -842,46 +292,27 @@
           <w:color w:val="222222"/>
           <w:sz w:val="22"/>
         </w:rPr>
-        <w:t>Applies the standard thresholds in §4 to compute force_risk, repetition_risk, duration_risk, vibration_risk, contact_stress_risk, posture_risk and their integer-coded versions. Output: data/processed/risk_profile.csv.</w:t>
+        <w:t>How hard the rider has to lift or push. We use the Borg CR10 lifting item. Action levels are the conventional Borg cut-offs: 0 to 3 is Low (acceptable), 4 to 6 is Medium (monitor), 7 to 10 is High (intervene).</w:t>
       </w:r>
     </w:p>
     <w:p>
       <w:pPr>
         <w:keepNext/>
-        <w:spacing w:before="240" w:after="120"/>
+        <w:spacing w:before="200" w:after="80"/>
       </w:pPr>
       <w:r>
         <w:rPr>
           <w:rFonts w:ascii="Calibri" w:hAnsi="Calibri" w:cs="Calibri" w:eastAsia="Calibri"/>
           <w:b/>
           <w:color w:val="2E86AB"/>
-          <w:sz w:val="28"/>
+          <w:sz w:val="26"/>
         </w:rPr>
-        <w:t>Phase 4 — Exploratory Data Analysis</w:t>
+        <w:t>Repetition</w:t>
       </w:r>
     </w:p>
     <w:p>
       <w:pPr>
-        <w:spacing w:after="120"/>
-      </w:pPr>
-      <w:r>
-        <w:rPr>
-          <w:rFonts w:ascii="Consolas" w:hAnsi="Consolas" w:cs="Consolas" w:eastAsia="Consolas"/>
-          <w:color w:val="555555"/>
-          <w:sz w:val="20"/>
-        </w:rPr>
-        <w:t>notebooks/04_eda.ipynb</w:t>
-      </w:r>
-      <w:r>
-        <w:rPr>
-          <w:rFonts w:ascii="Calibri" w:hAnsi="Calibri" w:cs="Calibri" w:eastAsia="Calibri"/>
-          <w:sz w:val="20"/>
-        </w:rPr>
-      </w:r>
-    </w:p>
-    <w:p>
-      <w:pPr>
-        <w:spacing w:after="120" w:before="0"/>
+        <w:spacing w:after="160" w:before="0"/>
       </w:pPr>
       <w:r>
         <w:rPr>
@@ -891,46 +322,27 @@
           <w:color w:val="222222"/>
           <w:sz w:val="22"/>
         </w:rPr>
-        <w:t>Produces demographics.png, nordic_prevalence.png, risk_factor_distribution.png, discomfort_by_demographic.png, risk_vs_discomfort.png, correlation_heatmap.png. All saved to outputs/figures/.</w:t>
+        <w:t>Deliveries per hour, computed as deliveries_num divided by work_hours_num. The original Phase 3 binning used pandas qcut into terciles, but the upper tercile boundary landed exactly on 35 / 9 = 3.889 (the worst real combination in the sample) and 55 of 182 riders tied at that value, all falling into Medium. We switched to fixed cuts at 2.5 and 3.75 so the worst case ends up in High. The trade-off is documented in the Limitations section.</w:t>
       </w:r>
     </w:p>
     <w:p>
       <w:pPr>
         <w:keepNext/>
-        <w:spacing w:before="240" w:after="120"/>
+        <w:spacing w:before="200" w:after="80"/>
       </w:pPr>
       <w:r>
         <w:rPr>
           <w:rFonts w:ascii="Calibri" w:hAnsi="Calibri" w:cs="Calibri" w:eastAsia="Calibri"/>
           <w:b/>
           <w:color w:val="2E86AB"/>
-          <w:sz w:val="28"/>
+          <w:sz w:val="26"/>
         </w:rPr>
-        <w:t>Phase 5 — Statistics</w:t>
+        <w:t>Posture</w:t>
       </w:r>
     </w:p>
     <w:p>
       <w:pPr>
-        <w:spacing w:after="120"/>
-      </w:pPr>
-      <w:r>
-        <w:rPr>
-          <w:rFonts w:ascii="Consolas" w:hAnsi="Consolas" w:cs="Consolas" w:eastAsia="Consolas"/>
-          <w:color w:val="555555"/>
-          <w:sz w:val="20"/>
-        </w:rPr>
-        <w:t>notebooks/05_stats.ipynb</w:t>
-      </w:r>
-      <w:r>
-        <w:rPr>
-          <w:rFonts w:ascii="Calibri" w:hAnsi="Calibri" w:cs="Calibri" w:eastAsia="Calibri"/>
-          <w:sz w:val="20"/>
-        </w:rPr>
-      </w:r>
-    </w:p>
-    <w:p>
-      <w:pPr>
-        <w:spacing w:after="120" w:before="0"/>
+        <w:spacing w:after="160" w:before="0"/>
       </w:pPr>
       <w:r>
         <w:rPr>
@@ -940,46 +352,27 @@
           <w:color w:val="222222"/>
           <w:sz w:val="22"/>
         </w:rPr>
-        <w:t>Chi-square (factor × discomfort) and logistic-regression OR / 95% CI / p across 10+ predictors. Output: outputs/tables/chi_square.csv, phase5_summary.csv.</w:t>
+        <w:t>RULA Table C, the final score from the standard RULA worksheet. The conventional action levels are 1 to 2 Low, 3 to 4 Medium, 5 or higher High.</w:t>
       </w:r>
     </w:p>
     <w:p>
       <w:pPr>
         <w:keepNext/>
-        <w:spacing w:before="240" w:after="120"/>
+        <w:spacing w:before="200" w:after="80"/>
       </w:pPr>
       <w:r>
         <w:rPr>
           <w:rFonts w:ascii="Calibri" w:hAnsi="Calibri" w:cs="Calibri" w:eastAsia="Calibri"/>
           <w:b/>
           <w:color w:val="2E86AB"/>
-          <w:sz w:val="28"/>
+          <w:sz w:val="26"/>
         </w:rPr>
-        <w:t>Phase 6 — ML Modelling</w:t>
+        <w:t>Duration</w:t>
       </w:r>
     </w:p>
     <w:p>
       <w:pPr>
-        <w:spacing w:after="120"/>
-      </w:pPr>
-      <w:r>
-        <w:rPr>
-          <w:rFonts w:ascii="Consolas" w:hAnsi="Consolas" w:cs="Consolas" w:eastAsia="Consolas"/>
-          <w:color w:val="555555"/>
-          <w:sz w:val="20"/>
-        </w:rPr>
-        <w:t>notebooks/06_modeling.ipynb</w:t>
-      </w:r>
-      <w:r>
-        <w:rPr>
-          <w:rFonts w:ascii="Calibri" w:hAnsi="Calibri" w:cs="Calibri" w:eastAsia="Calibri"/>
-          <w:sz w:val="20"/>
-        </w:rPr>
-      </w:r>
-    </w:p>
-    <w:p>
-      <w:pPr>
-        <w:spacing w:after="120" w:before="0"/>
+        <w:spacing w:after="160" w:before="0"/>
       </w:pPr>
       <w:r>
         <w:rPr>
@@ -989,46 +382,27 @@
           <w:color w:val="222222"/>
           <w:sz w:val="22"/>
         </w:rPr>
-        <w:t>For each target, runs 7 algorithms (LogisticRegression, DecisionTree, RandomForest, ExtraTrees, HistGradientBoosting, XGBoost, StackingClassifier) inside an imbalanced-learn Pipeline with SMOTE oversampling, tuned via GridSearchCV under StratifiedKFold(5). Posture target gets the survey feature_pool plus 11 RULA components plus 8 QEC scores (63 features); other targets get 41–42 survey features. Output: 6 joblib pickles in outputs/models/ and result tables in outputs/tables/ (cv_results.csv, best_models.csv, phase6_summary.csv, classification_reports.csv, confusion_matrices.csv).</w:t>
+        <w:t>Continuous riding hours. 5 hours or less is Low, 6 to 7 is Medium, more than 7 is High.</w:t>
       </w:r>
     </w:p>
     <w:p>
       <w:pPr>
         <w:keepNext/>
-        <w:spacing w:before="240" w:after="120"/>
+        <w:spacing w:before="200" w:after="80"/>
       </w:pPr>
       <w:r>
         <w:rPr>
           <w:rFonts w:ascii="Calibri" w:hAnsi="Calibri" w:cs="Calibri" w:eastAsia="Calibri"/>
           <w:b/>
           <w:color w:val="2E86AB"/>
-          <w:sz w:val="28"/>
+          <w:sz w:val="26"/>
         </w:rPr>
-        <w:t>Phase 7 — Evaluation</w:t>
+        <w:t>Contact Stress</w:t>
       </w:r>
     </w:p>
     <w:p>
       <w:pPr>
-        <w:spacing w:after="120"/>
-      </w:pPr>
-      <w:r>
-        <w:rPr>
-          <w:rFonts w:ascii="Consolas" w:hAnsi="Consolas" w:cs="Consolas" w:eastAsia="Consolas"/>
-          <w:color w:val="555555"/>
-          <w:sz w:val="20"/>
-        </w:rPr>
-        <w:t>notebooks/07_evaluation.ipynb</w:t>
-      </w:r>
-      <w:r>
-        <w:rPr>
-          <w:rFonts w:ascii="Calibri" w:hAnsi="Calibri" w:cs="Calibri" w:eastAsia="Calibri"/>
-          <w:sz w:val="20"/>
-        </w:rPr>
-      </w:r>
-    </w:p>
-    <w:p>
-      <w:pPr>
-        <w:spacing w:after="120" w:before="0"/>
+        <w:spacing w:after="160" w:before="0"/>
       </w:pPr>
       <w:r>
         <w:rPr>
@@ -1038,46 +412,27 @@
           <w:color w:val="222222"/>
           <w:sz w:val="22"/>
         </w:rPr>
-        <w:t>Re-uses the best-by-F1 model per target, computes cross_val_predict, generates confusion matrices and ROC curves per factor, extracts feature_importances_ (or coef_) per model. Output: confusion_matrices.png, roc_curves.png, feature_importance.png + roc_auc.csv, feature_importance.csv, phase7_summary.csv.</w:t>
+        <w:t>How much load presses against the rider's body. A composite of carrying mode (storage box, backpack, handlebar, handheld), working hours, and a small age multiplier. We bin into terciles.</w:t>
       </w:r>
     </w:p>
     <w:p>
       <w:pPr>
         <w:keepNext/>
-        <w:spacing w:before="240" w:after="120"/>
+        <w:spacing w:before="200" w:after="80"/>
       </w:pPr>
       <w:r>
         <w:rPr>
           <w:rFonts w:ascii="Calibri" w:hAnsi="Calibri" w:cs="Calibri" w:eastAsia="Calibri"/>
           <w:b/>
           <w:color w:val="2E86AB"/>
-          <w:sz w:val="28"/>
+          <w:sz w:val="26"/>
         </w:rPr>
-        <w:t>Phase 8 — Results Write-up</w:t>
+        <w:t>Vibration</w:t>
       </w:r>
     </w:p>
     <w:p>
       <w:pPr>
-        <w:spacing w:after="120"/>
-      </w:pPr>
-      <w:r>
-        <w:rPr>
-          <w:rFonts w:ascii="Consolas" w:hAnsi="Consolas" w:cs="Consolas" w:eastAsia="Consolas"/>
-          <w:color w:val="555555"/>
-          <w:sz w:val="20"/>
-        </w:rPr>
-        <w:t>docs/results.md</w:t>
-      </w:r>
-      <w:r>
-        <w:rPr>
-          <w:rFonts w:ascii="Calibri" w:hAnsi="Calibri" w:cs="Calibri" w:eastAsia="Calibri"/>
-          <w:sz w:val="20"/>
-        </w:rPr>
-      </w:r>
-    </w:p>
-    <w:p>
-      <w:pPr>
-        <w:spacing w:after="120" w:before="0"/>
+        <w:spacing w:after="160" w:before="0"/>
       </w:pPr>
       <w:r>
         <w:rPr>
@@ -1087,46 +442,27 @@
           <w:color w:val="222222"/>
           <w:sz w:val="22"/>
         </w:rPr>
-        <w:t>Mentor-facing markdown with the sample profile, NMQ prevalence, per-factor Stage-1 distribution, Stage-2 ML metrics with macro AUC, per-factor positioning notes, recommendations, and limitations.</w:t>
+        <w:t>Vehicle type multiplied by working hours per day. Scooter is 1 and motor bike is 2, so a motorbike rider working 9 hours scores 18 (the worst observed). This is a proxy because we did not have per-rider accelerometer data; what we can measure is the relative exposure.</w:t>
       </w:r>
     </w:p>
     <w:p>
       <w:pPr>
         <w:keepNext/>
-        <w:spacing w:before="240" w:after="120"/>
+        <w:spacing w:before="320" w:after="80"/>
       </w:pPr>
       <w:r>
         <w:rPr>
           <w:rFonts w:ascii="Calibri" w:hAnsi="Calibri" w:cs="Calibri" w:eastAsia="Calibri"/>
           <w:b/>
-          <w:color w:val="2E86AB"/>
-          <w:sz w:val="28"/>
+          <w:color w:val="1F3B73"/>
+          <w:sz w:val="32"/>
         </w:rPr>
-        <w:t>Phase 9 — Slide Deck</w:t>
+        <w:t>Data</w:t>
       </w:r>
     </w:p>
     <w:p>
       <w:pPr>
-        <w:spacing w:after="120"/>
-      </w:pPr>
-      <w:r>
-        <w:rPr>
-          <w:rFonts w:ascii="Consolas" w:hAnsi="Consolas" w:cs="Consolas" w:eastAsia="Consolas"/>
-          <w:color w:val="555555"/>
-          <w:sz w:val="20"/>
-        </w:rPr>
-        <w:t>src/build_results_deck.py</w:t>
-      </w:r>
-      <w:r>
-        <w:rPr>
-          <w:rFonts w:ascii="Calibri" w:hAnsi="Calibri" w:cs="Calibri" w:eastAsia="Calibri"/>
-          <w:sz w:val="20"/>
-        </w:rPr>
-      </w:r>
-    </w:p>
-    <w:p>
-      <w:pPr>
-        <w:spacing w:after="120" w:before="0"/>
+        <w:spacing w:after="160" w:before="0"/>
       </w:pPr>
       <w:r>
         <w:rPr>
@@ -1136,174 +472,12 @@
           <w:color w:val="222222"/>
           <w:sz w:val="22"/>
         </w:rPr>
-        <w:t>Loads the original Final.pptx, appends a Results &amp; Findings section (section header, demographics, NMQ prevalence, risk distribution, discomfort by demographic, risk vs. discomfort, correlation heatmap, ML metrics text slide, confusion matrices, ROC curves, feature importance, benchmarks text, limitations text, recommendations text), moves the Thank You slide to the end, saves WITH_RESULTS.pptx (53 slides).</w:t>
+        <w:t>Two files. data/raw/delivery_rider_survey.csv has 182 rows and 48 columns. Questions 1 to 17 cover demographics, lifestyle, and work pattern. Q18 is the Nordic 12-month body-pain inventory across 9 body areas. Q19 covers the previous 7 days for 4 areas. Q20 to Q24 are follow-up Yes/No items about whether discomfort affected performance, whether the rider took leave, saw a doctor, and so on. Q25 to Q30 are the six NASA-TLX 0-100 sliders. Q31 to Q36 are the six Borg CR10 0-10 items.</w:t>
       </w:r>
     </w:p>
     <w:p>
       <w:pPr>
-        <w:keepNext/>
-        <w:spacing w:before="360" w:after="120"/>
-      </w:pPr>
-      <w:r>
-        <w:rPr>
-          <w:rFonts w:ascii="Calibri" w:hAnsi="Calibri" w:cs="Calibri" w:eastAsia="Calibri"/>
-          <w:b/>
-          <w:color w:val="1F3B73"/>
-          <w:sz w:val="36"/>
-        </w:rPr>
-        <w:t>7. Headline findings</w:t>
-      </w:r>
-    </w:p>
-    <w:p>
-      <w:pPr>
-        <w:keepNext/>
-        <w:spacing w:before="240" w:after="120"/>
-      </w:pPr>
-      <w:r>
-        <w:rPr>
-          <w:rFonts w:ascii="Calibri" w:hAnsi="Calibri" w:cs="Calibri" w:eastAsia="Calibri"/>
-          <w:b/>
-          <w:color w:val="2E86AB"/>
-          <w:sz w:val="28"/>
-        </w:rPr>
-        <w:t>Sample profile</w:t>
-      </w:r>
-    </w:p>
-    <w:p>
-      <w:pPr>
-        <w:pStyle w:val="ListBullet"/>
-        <w:spacing w:after="40"/>
-      </w:pPr>
-      <w:r>
-        <w:rPr>
-          <w:rFonts w:ascii="Calibri" w:hAnsi="Calibri" w:cs="Calibri" w:eastAsia="Calibri"/>
-          <w:sz w:val="22"/>
-        </w:rPr>
-        <w:t>n = 182 riders; 152 Male / 30 Female</w:t>
-      </w:r>
-    </w:p>
-    <w:p>
-      <w:pPr>
-        <w:pStyle w:val="ListBullet"/>
-        <w:spacing w:after="40"/>
-      </w:pPr>
-      <w:r>
-        <w:rPr>
-          <w:rFonts w:ascii="Calibri" w:hAnsi="Calibri" w:cs="Calibri" w:eastAsia="Calibri"/>
-          <w:sz w:val="22"/>
-        </w:rPr>
-        <w:t>Age: 78 under 25, 66 in 25–35, 30 in 36–45, 8 in ≥46</w:t>
-      </w:r>
-    </w:p>
-    <w:p>
-      <w:pPr>
-        <w:pStyle w:val="ListBullet"/>
-        <w:spacing w:after="40"/>
-      </w:pPr>
-      <w:r>
-        <w:rPr>
-          <w:rFonts w:ascii="Calibri" w:hAnsi="Calibri" w:cs="Calibri" w:eastAsia="Calibri"/>
-          <w:sz w:val="22"/>
-        </w:rPr>
-        <w:t>Platforms: Blinkit 97, Zepto 80, Both 5</w:t>
-      </w:r>
-    </w:p>
-    <w:p>
-      <w:pPr>
-        <w:pStyle w:val="ListBullet"/>
-        <w:spacing w:after="40"/>
-      </w:pPr>
-      <w:r>
-        <w:rPr>
-          <w:rFonts w:ascii="Calibri" w:hAnsi="Calibri" w:cs="Calibri" w:eastAsia="Calibri"/>
-          <w:sz w:val="22"/>
-        </w:rPr>
-        <w:t>Vehicles: Scooter 94, Motor bike 88</w:t>
-      </w:r>
-    </w:p>
-    <w:p>
-      <w:pPr>
-        <w:pStyle w:val="ListBullet"/>
-        <w:spacing w:after="40"/>
-      </w:pPr>
-      <w:r>
-        <w:rPr>
-          <w:rFonts w:ascii="Calibri" w:hAnsi="Calibri" w:cs="Calibri" w:eastAsia="Calibri"/>
-          <w:sz w:val="22"/>
-        </w:rPr>
-        <w:t>49% work &gt;8 hours/day</w:t>
-      </w:r>
-    </w:p>
-    <w:p>
-      <w:pPr>
-        <w:keepNext/>
-        <w:spacing w:before="240" w:after="120"/>
-      </w:pPr>
-      <w:r>
-        <w:rPr>
-          <w:rFonts w:ascii="Calibri" w:hAnsi="Calibri" w:cs="Calibri" w:eastAsia="Calibri"/>
-          <w:b/>
-          <w:color w:val="2E86AB"/>
-          <w:sz w:val="28"/>
-        </w:rPr>
-        <w:t>NMQ 12-month pain prevalence (top 4)</w:t>
-      </w:r>
-    </w:p>
-    <w:p>
-      <w:pPr>
-        <w:pStyle w:val="ListBullet"/>
-        <w:spacing w:after="40"/>
-      </w:pPr>
-      <w:r>
-        <w:rPr>
-          <w:rFonts w:ascii="Calibri" w:hAnsi="Calibri" w:cs="Calibri" w:eastAsia="Calibri"/>
-          <w:sz w:val="22"/>
-        </w:rPr>
-        <w:t>Lower back: 61.5%</w:t>
-      </w:r>
-    </w:p>
-    <w:p>
-      <w:pPr>
-        <w:pStyle w:val="ListBullet"/>
-        <w:spacing w:after="40"/>
-      </w:pPr>
-      <w:r>
-        <w:rPr>
-          <w:rFonts w:ascii="Calibri" w:hAnsi="Calibri" w:cs="Calibri" w:eastAsia="Calibri"/>
-          <w:sz w:val="22"/>
-        </w:rPr>
-        <w:t>Upper back: 49.5%</w:t>
-      </w:r>
-    </w:p>
-    <w:p>
-      <w:pPr>
-        <w:pStyle w:val="ListBullet"/>
-        <w:spacing w:after="40"/>
-      </w:pPr>
-      <w:r>
-        <w:rPr>
-          <w:rFonts w:ascii="Calibri" w:hAnsi="Calibri" w:cs="Calibri" w:eastAsia="Calibri"/>
-          <w:sz w:val="22"/>
-        </w:rPr>
-        <w:t>Shoulders: 46.7%</w:t>
-      </w:r>
-    </w:p>
-    <w:p>
-      <w:pPr>
-        <w:pStyle w:val="ListBullet"/>
-        <w:spacing w:after="40"/>
-      </w:pPr>
-      <w:r>
-        <w:rPr>
-          <w:rFonts w:ascii="Calibri" w:hAnsi="Calibri" w:cs="Calibri" w:eastAsia="Calibri"/>
-          <w:sz w:val="22"/>
-        </w:rPr>
-        <w:t>Wrists / Hands: 45.1%</w:t>
-      </w:r>
-    </w:p>
-    <w:p>
-      <w:pPr>
-        <w:spacing w:after="120" w:before="0"/>
+        <w:spacing w:after="160" w:before="0"/>
       </w:pPr>
       <w:r>
         <w:rPr>
@@ -1313,20 +487,230 @@
           <w:color w:val="222222"/>
           <w:sz w:val="22"/>
         </w:rPr>
-        <w:t>Overall: 84.6% of riders reported pain in at least one body area in the last 12 months.</w:t>
+        <w:t>data/raw/posture_data.xlsx has 182 observation records spread across the sheets. Each record carries 11 RULA components (upper_arm, lower_arm, wrist, wrist_twist, neck_position, trunk_position, legs, muscle_a, force_a, muscle_b, force_b), 3 derived RULA Table scores (a, b, c), and 8 QEC scores (qec_back, qec_shoulder_arm, qec_wrist_hand, qec_neck, qec_driving, qec_vibration, qec_work_pace, qec_stress).</w:t>
+      </w:r>
+    </w:p>
+    <w:p>
+      <w:pPr>
+        <w:spacing w:after="160" w:before="0"/>
+      </w:pPr>
+      <w:r>
+        <w:rPr>
+          <w:rFonts w:ascii="Calibri" w:hAnsi="Calibri" w:cs="Calibri" w:eastAsia="Calibri"/>
+          <w:b w:val="0"/>
+          <w:i w:val="0"/>
+          <w:color w:val="222222"/>
+          <w:sz w:val="22"/>
+        </w:rPr>
+        <w:t>The observation records do not carry a rider identifier. Phase 2 Step 8 pairs them to the survey using a severity-rank merge: riders are ranked by an exposure-severity score (NMQ count + fatigue_score + work_hours_num, each normalised), the observation rows are ranked by rula_table_c, and the two are joined rank to rank. The implication is discussed under Limitations.</w:t>
       </w:r>
     </w:p>
     <w:p>
       <w:pPr>
         <w:keepNext/>
-        <w:spacing w:before="240" w:after="120"/>
+        <w:spacing w:before="320" w:after="80"/>
+      </w:pPr>
+      <w:r>
+        <w:rPr>
+          <w:rFonts w:ascii="Calibri" w:hAnsi="Calibri" w:cs="Calibri" w:eastAsia="Calibri"/>
+          <w:b/>
+          <w:color w:val="1F3B73"/>
+          <w:sz w:val="32"/>
+        </w:rPr>
+        <w:t>Feature engineering</w:t>
+      </w:r>
+    </w:p>
+    <w:p>
+      <w:pPr>
+        <w:spacing w:after="160" w:before="0"/>
+      </w:pPr>
+      <w:r>
+        <w:rPr>
+          <w:rFonts w:ascii="Calibri" w:hAnsi="Calibri" w:cs="Calibri" w:eastAsia="Calibri"/>
+          <w:b w:val="0"/>
+          <w:i w:val="0"/>
+          <w:color w:val="222222"/>
+          <w:sz w:val="22"/>
+        </w:rPr>
+        <w:t>Phase 2 turns the raw values into the columns the models can consume. Binned categoricals get ordinal codes (age_ord, education_ord, income_ord, job_duration_ord). Bins that come as ranges get numeric midpoints (work_hours_num, deliveries_num, work_days_num, rest_break_num). Yes/No questions become 0/1. The vehicle type and carrying mode are ranked from least to most strenuous. Six NASA-TLX items collapse into workload_score (simple mean, with the satisfaction item running in load-direction). The six Borg items collapse into fatigue_score. force_exertion is the Borg lifting item by itself. vibration_index is vehicle_rank multiplied by work_hours_num.</w:t>
+      </w:r>
+    </w:p>
+    <w:p>
+      <w:pPr>
+        <w:spacing w:after="160" w:before="0"/>
+      </w:pPr>
+      <w:r>
+        <w:rPr>
+          <w:rFonts w:ascii="Calibri" w:hAnsi="Calibri" w:cs="Calibri" w:eastAsia="Calibri"/>
+          <w:b w:val="0"/>
+          <w:i w:val="0"/>
+          <w:color w:val="222222"/>
+          <w:sz w:val="22"/>
+        </w:rPr>
+        <w:t>Five interaction features are added so a model can pick up that, for example, an older rider with high workload is at extra risk: workload_x_fatigue, workload_x_age, force_x_age, fatigue_x_jobdur, deliv_x_days. Phase 2 Step 5b adds gender, region, marital status, delivery platform, type of break, tobacco use, and alcohol use as ordinal ranks. Step 4b creates short-name aliases for the 18 Yes/No NMQ + 7-day + outcome items so the feature pool stays readable. The Posture observations are merged in Step 8 by severity rank.</w:t>
+      </w:r>
+    </w:p>
+    <w:p>
+      <w:pPr>
+        <w:spacing w:after="160" w:before="0"/>
+      </w:pPr>
+      <w:r>
+        <w:rPr>
+          <w:rFonts w:ascii="Calibri" w:hAnsi="Calibri" w:cs="Calibri" w:eastAsia="Calibri"/>
+          <w:b w:val="0"/>
+          <w:i w:val="0"/>
+          <w:color w:val="222222"/>
+          <w:sz w:val="22"/>
+        </w:rPr>
+        <w:t>The resulting data/processed/model_ready.csv has 182 rows and 121 columns.</w:t>
+      </w:r>
+    </w:p>
+    <w:p>
+      <w:pPr>
+        <w:keepNext/>
+        <w:spacing w:before="320" w:after="80"/>
+      </w:pPr>
+      <w:r>
+        <w:rPr>
+          <w:rFonts w:ascii="Calibri" w:hAnsi="Calibri" w:cs="Calibri" w:eastAsia="Calibri"/>
+          <w:b/>
+          <w:color w:val="1F3B73"/>
+          <w:sz w:val="32"/>
+        </w:rPr>
+        <w:t>Risk scoring</w:t>
+      </w:r>
+    </w:p>
+    <w:p>
+      <w:pPr>
+        <w:spacing w:after="160" w:before="0"/>
+      </w:pPr>
+      <w:r>
+        <w:rPr>
+          <w:rFonts w:ascii="Calibri" w:hAnsi="Calibri" w:cs="Calibri" w:eastAsia="Calibri"/>
+          <w:b w:val="0"/>
+          <w:i w:val="0"/>
+          <w:color w:val="222222"/>
+          <w:sz w:val="22"/>
+        </w:rPr>
+        <w:t>Phase 3 takes model_ready.csv and applies the thresholds described under The six risk factors. It writes data/processed/risk_profile.csv with the six string labels (force_risk, repetition_risk, etc.) and their integer codes (force_risk_code etc., 0/1/2 for Low/Medium/High).</w:t>
+      </w:r>
+    </w:p>
+    <w:p>
+      <w:pPr>
+        <w:keepNext/>
+        <w:spacing w:before="320" w:after="80"/>
+      </w:pPr>
+      <w:r>
+        <w:rPr>
+          <w:rFonts w:ascii="Calibri" w:hAnsi="Calibri" w:cs="Calibri" w:eastAsia="Calibri"/>
+          <w:b/>
+          <w:color w:val="1F3B73"/>
+          <w:sz w:val="32"/>
+        </w:rPr>
+        <w:t>Models</w:t>
+      </w:r>
+    </w:p>
+    <w:p>
+      <w:pPr>
+        <w:spacing w:after="160" w:before="0"/>
+      </w:pPr>
+      <w:r>
+        <w:rPr>
+          <w:rFonts w:ascii="Calibri" w:hAnsi="Calibri" w:cs="Calibri" w:eastAsia="Calibri"/>
+          <w:b w:val="0"/>
+          <w:i w:val="0"/>
+          <w:color w:val="222222"/>
+          <w:sz w:val="22"/>
+        </w:rPr>
+        <w:t>Phase 6 trains a separate classifier per risk factor. Seven candidate algorithms are evaluated for each target: Logistic Regression, Decision Tree, Random Forest, Extra Trees, Hist Gradient Boosting, XGBoost, and a Stacking ensemble that combines RF, ExtraTrees, XGBoost, and HistGBM with a Logistic Regression meta-learner. Each candidate is wrapped in an imbalanced-learn pipeline that runs SMOTE inside every CV fold to balance the minority class. Hyperparameters are tuned via GridSearchCV on F1 macro with StratifiedKFold(5). The best-by-F1 model per target is refit on the full sample and saved to outputs/models/best_&lt;factor&gt;.pkl.</w:t>
+      </w:r>
+    </w:p>
+    <w:p>
+      <w:pPr>
+        <w:spacing w:after="160" w:before="0"/>
+      </w:pPr>
+      <w:r>
+        <w:rPr>
+          <w:rFonts w:ascii="Calibri" w:hAnsi="Calibri" w:cs="Calibri" w:eastAsia="Calibri"/>
+          <w:b w:val="0"/>
+          <w:i w:val="0"/>
+          <w:color w:val="222222"/>
+          <w:sz w:val="22"/>
+        </w:rPr>
+        <w:t>Each saved bundle is a dict with three keys: model (the fitted imbalanced-learn pipeline), features (the exact list of feature names the model was trained on), and classes (the original integer class codes so the LabelEncoded output can be mapped back). src/predict.py reads the features list straight from the bundle, so adding new features in Phase 2 requires no code change in predict.py.</w:t>
+      </w:r>
+    </w:p>
+    <w:p>
+      <w:pPr>
+        <w:spacing w:after="160" w:before="0"/>
+      </w:pPr>
+      <w:r>
+        <w:rPr>
+          <w:rFonts w:ascii="Calibri" w:hAnsi="Calibri" w:cs="Calibri" w:eastAsia="Calibri"/>
+          <w:b w:val="0"/>
+          <w:i w:val="0"/>
+          <w:color w:val="222222"/>
+          <w:sz w:val="22"/>
+        </w:rPr>
+        <w:t>Each factor's defining input is excluded from its own feature pool, otherwise the model would simply memorise the Stage-1 rule. Force excludes force_exertion and force_x_age. Repetition excludes deliveries_num, work_hours_num, and deliv_x_days. Duration excludes work_hours_num and vibration_index (the second was a leakage discovery, see Limitations). Vibration excludes vibration_index, vehicle_rank, and work_hours_num. Contact Stress excludes carrying_contact_rank and work_hours_num. Posture does not exclude anything from the survey pool but is also given the 11 RULA components and 8 QEC scores; the three derived RULA Table scores are excluded as direct leakage because posture_risk is rula_table_c binned.</w:t>
+      </w:r>
+    </w:p>
+    <w:p>
+      <w:pPr>
+        <w:keepNext/>
+        <w:spacing w:before="320" w:after="80"/>
+      </w:pPr>
+      <w:r>
+        <w:rPr>
+          <w:rFonts w:ascii="Calibri" w:hAnsi="Calibri" w:cs="Calibri" w:eastAsia="Calibri"/>
+          <w:b/>
+          <w:color w:val="1F3B73"/>
+          <w:sz w:val="32"/>
+        </w:rPr>
+        <w:t>Sample and findings</w:t>
+      </w:r>
+    </w:p>
+    <w:p>
+      <w:pPr>
+        <w:spacing w:after="160" w:before="0"/>
+      </w:pPr>
+      <w:r>
+        <w:rPr>
+          <w:rFonts w:ascii="Calibri" w:hAnsi="Calibri" w:cs="Calibri" w:eastAsia="Calibri"/>
+          <w:b w:val="0"/>
+          <w:i w:val="0"/>
+          <w:color w:val="222222"/>
+          <w:sz w:val="22"/>
+        </w:rPr>
+        <w:t>The sample is 152 male and 30 female. Age skews young: 78 riders under 25, 66 in the 25 to 35 band, 30 in 36 to 45, and 8 in 46 and above. 49 percent of the sample works more than 8 hours per day. 94 ride scooters and 88 ride motor bikes. Blinkit accounts for 97 riders, Zepto for 80, with 5 working both platforms.</w:t>
+      </w:r>
+    </w:p>
+    <w:p>
+      <w:pPr>
+        <w:spacing w:after="160" w:before="0"/>
+      </w:pPr>
+      <w:r>
+        <w:rPr>
+          <w:rFonts w:ascii="Calibri" w:hAnsi="Calibri" w:cs="Calibri" w:eastAsia="Calibri"/>
+          <w:b w:val="0"/>
+          <w:i w:val="0"/>
+          <w:color w:val="222222"/>
+          <w:sz w:val="22"/>
+        </w:rPr>
+        <w:t>84.6 percent of the riders reported pain in at least one body area in the last 12 months. Lower back is the most common complaint at 61.5 percent, followed by upper back (49.5%), shoulders (46.7%), wrists and hands (45.1%), hips and thighs (41.2%), ankles and feet (40.7%), knees (39.6%), neck (37.9%), and elbows (33.5%).</w:t>
+      </w:r>
+    </w:p>
+    <w:p>
+      <w:pPr>
+        <w:keepNext/>
+        <w:spacing w:before="200" w:after="80"/>
       </w:pPr>
       <w:r>
         <w:rPr>
           <w:rFonts w:ascii="Calibri" w:hAnsi="Calibri" w:cs="Calibri" w:eastAsia="Calibri"/>
           <w:b/>
           <w:color w:val="2E86AB"/>
-          <w:sz w:val="28"/>
+          <w:sz w:val="26"/>
         </w:rPr>
         <w:t>Stage-1 risk distribution</w:t>
       </w:r>
@@ -1351,9 +735,6 @@
             <w:shd w:fill="1F3B73"/>
           </w:tcPr>
           <w:p>
-            <w:pPr>
-              <w:jc w:val="left"/>
-            </w:pPr>
             <w:r/>
             <w:r>
               <w:rPr>
@@ -1372,9 +753,6 @@
             <w:shd w:fill="1F3B73"/>
           </w:tcPr>
           <w:p>
-            <w:pPr>
-              <w:jc w:val="left"/>
-            </w:pPr>
             <w:r/>
             <w:r>
               <w:rPr>
@@ -1393,9 +771,6 @@
             <w:shd w:fill="1F3B73"/>
           </w:tcPr>
           <w:p>
-            <w:pPr>
-              <w:jc w:val="left"/>
-            </w:pPr>
             <w:r/>
             <w:r>
               <w:rPr>
@@ -1414,9 +789,6 @@
             <w:shd w:fill="1F3B73"/>
           </w:tcPr>
           <w:p>
-            <w:pPr>
-              <w:jc w:val="left"/>
-            </w:pPr>
             <w:r/>
             <w:r>
               <w:rPr>
@@ -1829,17 +1201,32 @@
     </w:tbl>
     <w:p>
       <w:pPr>
+        <w:spacing w:after="160" w:before="0"/>
+      </w:pPr>
+      <w:r>
+        <w:rPr>
+          <w:rFonts w:ascii="Calibri" w:hAnsi="Calibri" w:cs="Calibri" w:eastAsia="Calibri"/>
+          <w:b w:val="0"/>
+          <w:i w:val="0"/>
+          <w:color w:val="222222"/>
+          <w:sz w:val="22"/>
+        </w:rPr>
+        <w:t>Posture, Duration, and Repetition are the three factors where the High band dominates. Posture is at 84 percent High (153 of 182 observations), Duration at 49 percent, Repetition at 41 percent after the binning fix.</w:t>
+      </w:r>
+    </w:p>
+    <w:p>
+      <w:pPr>
         <w:keepNext/>
-        <w:spacing w:before="240" w:after="120"/>
+        <w:spacing w:before="200" w:after="80"/>
       </w:pPr>
       <w:r>
         <w:rPr>
           <w:rFonts w:ascii="Calibri" w:hAnsi="Calibri" w:cs="Calibri" w:eastAsia="Calibri"/>
           <w:b/>
           <w:color w:val="2E86AB"/>
-          <w:sz w:val="28"/>
+          <w:sz w:val="26"/>
         </w:rPr>
-        <w:t>Stage-2 ML metrics (best model per factor, 5-fold CV)</w:t>
+        <w:t>Stage-2 model performance</w:t>
       </w:r>
     </w:p>
     <w:tbl>
@@ -1864,9 +1251,6 @@
             <w:shd w:fill="1F3B73"/>
           </w:tcPr>
           <w:p>
-            <w:pPr>
-              <w:jc w:val="left"/>
-            </w:pPr>
             <w:r/>
             <w:r>
               <w:rPr>
@@ -1885,9 +1269,6 @@
             <w:shd w:fill="1F3B73"/>
           </w:tcPr>
           <w:p>
-            <w:pPr>
-              <w:jc w:val="left"/>
-            </w:pPr>
             <w:r/>
             <w:r>
               <w:rPr>
@@ -1906,9 +1287,6 @@
             <w:shd w:fill="1F3B73"/>
           </w:tcPr>
           <w:p>
-            <w:pPr>
-              <w:jc w:val="left"/>
-            </w:pPr>
             <w:r/>
             <w:r>
               <w:rPr>
@@ -1923,13 +1301,10 @@
         </w:tc>
         <w:tc>
           <w:tcPr>
-            <w:tcW w:type="dxa" w:w="1361"/>
+            <w:tcW w:type="dxa" w:w="1247"/>
             <w:shd w:fill="1F3B73"/>
           </w:tcPr>
           <w:p>
-            <w:pPr>
-              <w:jc w:val="left"/>
-            </w:pPr>
             <w:r/>
             <w:r>
               <w:rPr>
@@ -1938,7 +1313,7 @@
                 <w:color w:val="FFFFFF"/>
                 <w:sz w:val="20"/>
               </w:rPr>
-              <w:t>CV F1 macro</w:t>
+              <w:t>F1 macro</w:t>
             </w:r>
           </w:p>
         </w:tc>
@@ -1948,9 +1323,6 @@
             <w:shd w:fill="1F3B73"/>
           </w:tcPr>
           <w:p>
-            <w:pPr>
-              <w:jc w:val="left"/>
-            </w:pPr>
             <w:r/>
             <w:r>
               <w:rPr>
@@ -1969,9 +1341,6 @@
             <w:shd w:fill="1F3B73"/>
           </w:tcPr>
           <w:p>
-            <w:pPr>
-              <w:jc w:val="left"/>
-            </w:pPr>
             <w:r/>
             <w:r>
               <w:rPr>
@@ -2036,7 +1405,7 @@
         </w:tc>
         <w:tc>
           <w:tcPr>
-            <w:tcW w:type="dxa" w:w="1361"/>
+            <w:tcW w:type="dxa" w:w="1247"/>
           </w:tcPr>
           <w:p>
             <w:r/>
@@ -2134,7 +1503,7 @@
         </w:tc>
         <w:tc>
           <w:tcPr>
-            <w:tcW w:type="dxa" w:w="1361"/>
+            <w:tcW w:type="dxa" w:w="1247"/>
           </w:tcPr>
           <w:p>
             <w:r/>
@@ -2232,7 +1601,7 @@
         </w:tc>
         <w:tc>
           <w:tcPr>
-            <w:tcW w:type="dxa" w:w="1361"/>
+            <w:tcW w:type="dxa" w:w="1247"/>
           </w:tcPr>
           <w:p>
             <w:r/>
@@ -2330,7 +1699,7 @@
         </w:tc>
         <w:tc>
           <w:tcPr>
-            <w:tcW w:type="dxa" w:w="1361"/>
+            <w:tcW w:type="dxa" w:w="1247"/>
           </w:tcPr>
           <w:p>
             <w:r/>
@@ -2428,7 +1797,7 @@
         </w:tc>
         <w:tc>
           <w:tcPr>
-            <w:tcW w:type="dxa" w:w="1361"/>
+            <w:tcW w:type="dxa" w:w="1247"/>
           </w:tcPr>
           <w:p>
             <w:r/>
@@ -2526,7 +1895,7 @@
         </w:tc>
         <w:tc>
           <w:tcPr>
-            <w:tcW w:type="dxa" w:w="1361"/>
+            <w:tcW w:type="dxa" w:w="1247"/>
           </w:tcPr>
           <w:p>
             <w:r/>
@@ -2576,128 +1945,7 @@
     </w:tbl>
     <w:p>
       <w:pPr>
-        <w:keepNext/>
-        <w:spacing w:before="240" w:after="120"/>
-      </w:pPr>
-      <w:r>
-        <w:rPr>
-          <w:rFonts w:ascii="Calibri" w:hAnsi="Calibri" w:cs="Calibri" w:eastAsia="Calibri"/>
-          <w:b/>
-          <w:color w:val="2E86AB"/>
-          <w:sz w:val="28"/>
-        </w:rPr>
-        <w:t>Statistical predictors of discomfort (logistic regression)</w:t>
-      </w:r>
-    </w:p>
-    <w:p>
-      <w:pPr>
-        <w:pStyle w:val="ListBullet"/>
-        <w:spacing w:after="40"/>
-      </w:pPr>
-      <w:r>
-        <w:rPr>
-          <w:rFonts w:ascii="Calibri" w:hAnsi="Calibri" w:cs="Calibri" w:eastAsia="Calibri"/>
-          <w:sz w:val="22"/>
-        </w:rPr>
-        <w:t>Age — OR 3.58, 95% CI 1.70–7.56, p = 0.0008 (strongest individual effect)</w:t>
-      </w:r>
-    </w:p>
-    <w:p>
-      <w:pPr>
-        <w:pStyle w:val="ListBullet"/>
-        <w:spacing w:after="40"/>
-      </w:pPr>
-      <w:r>
-        <w:rPr>
-          <w:rFonts w:ascii="Calibri" w:hAnsi="Calibri" w:cs="Calibri" w:eastAsia="Calibri"/>
-          <w:sz w:val="22"/>
-        </w:rPr>
-        <w:t>Job duration — OR 2.89, p = 0.001</w:t>
-      </w:r>
-    </w:p>
-    <w:p>
-      <w:pPr>
-        <w:pStyle w:val="ListBullet"/>
-        <w:spacing w:after="40"/>
-      </w:pPr>
-      <w:r>
-        <w:rPr>
-          <w:rFonts w:ascii="Calibri" w:hAnsi="Calibri" w:cs="Calibri" w:eastAsia="Calibri"/>
-          <w:sz w:val="22"/>
-        </w:rPr>
-        <w:t>Education — OR 0.33, p = 0.04 (protective)</w:t>
-      </w:r>
-    </w:p>
-    <w:p>
-      <w:pPr>
-        <w:pStyle w:val="ListBullet"/>
-        <w:spacing w:after="40"/>
-      </w:pPr>
-      <w:r>
-        <w:rPr>
-          <w:rFonts w:ascii="Calibri" w:hAnsi="Calibri" w:cs="Calibri" w:eastAsia="Calibri"/>
-          <w:sz w:val="22"/>
-        </w:rPr>
-        <w:t>Income — OR 2.00, p = 0.004</w:t>
-      </w:r>
-    </w:p>
-    <w:p>
-      <w:pPr>
-        <w:pStyle w:val="ListBullet"/>
-        <w:spacing w:after="40"/>
-      </w:pPr>
-      <w:r>
-        <w:rPr>
-          <w:rFonts w:ascii="Calibri" w:hAnsi="Calibri" w:cs="Calibri" w:eastAsia="Calibri"/>
-          <w:sz w:val="22"/>
-        </w:rPr>
-        <w:t>Fatigue score — OR 1.43, p = 0.003</w:t>
-      </w:r>
-    </w:p>
-    <w:p>
-      <w:pPr>
-        <w:pStyle w:val="ListBullet"/>
-        <w:spacing w:after="40"/>
-      </w:pPr>
-      <w:r>
-        <w:rPr>
-          <w:rFonts w:ascii="Calibri" w:hAnsi="Calibri" w:cs="Calibri" w:eastAsia="Calibri"/>
-          <w:sz w:val="22"/>
-        </w:rPr>
-        <w:t>Workload score — OR 1.06 per point, p = 0.0005</w:t>
-      </w:r>
-    </w:p>
-    <w:p>
-      <w:pPr>
-        <w:pStyle w:val="ListBullet"/>
-        <w:spacing w:after="40"/>
-      </w:pPr>
-      <w:r>
-        <w:rPr>
-          <w:rFonts w:ascii="Calibri" w:hAnsi="Calibri" w:cs="Calibri" w:eastAsia="Calibri"/>
-          <w:sz w:val="22"/>
-        </w:rPr>
-        <w:t>Deliveries per day — OR 1.05, p = 0.045</w:t>
-      </w:r>
-    </w:p>
-    <w:p>
-      <w:pPr>
-        <w:keepNext/>
-        <w:spacing w:before="360" w:after="120"/>
-      </w:pPr>
-      <w:r>
-        <w:rPr>
-          <w:rFonts w:ascii="Calibri" w:hAnsi="Calibri" w:cs="Calibri" w:eastAsia="Calibri"/>
-          <w:b/>
-          <w:color w:val="1F3B73"/>
-          <w:sz w:val="36"/>
-        </w:rPr>
-        <w:t>8. The Streamlit web application</w:t>
-      </w:r>
-    </w:p>
-    <w:p>
-      <w:pPr>
-        <w:spacing w:after="120" w:before="0"/>
+        <w:spacing w:after="160" w:before="0"/>
       </w:pPr>
       <w:r>
         <w:rPr>
@@ -2707,12 +1955,72 @@
           <w:color w:val="222222"/>
           <w:sz w:val="22"/>
         </w:rPr>
-        <w:t>Start with:</w:t>
+        <w:t>The five survey-derived factors land between 58 and 62 percent accuracy with macro AUC in the 71 to 76 percent range. Posture reaches 97 percent accuracy and 98 percent AUC because it is the only model that receives real observation inputs (11 RULA components and 8 QEC scores) on top of the survey features.</w:t>
       </w:r>
     </w:p>
     <w:p>
       <w:pPr>
-        <w:spacing w:before="80" w:after="160"/>
+        <w:keepNext/>
+        <w:spacing w:before="200" w:after="80"/>
+      </w:pPr>
+      <w:r>
+        <w:rPr>
+          <w:rFonts w:ascii="Calibri" w:hAnsi="Calibri" w:cs="Calibri" w:eastAsia="Calibri"/>
+          <w:b/>
+          <w:color w:val="2E86AB"/>
+          <w:sz w:val="26"/>
+        </w:rPr>
+        <w:t>Statistical predictors of discomfort</w:t>
+      </w:r>
+    </w:p>
+    <w:p>
+      <w:pPr>
+        <w:spacing w:after="160" w:before="0"/>
+      </w:pPr>
+      <w:r>
+        <w:rPr>
+          <w:rFonts w:ascii="Calibri" w:hAnsi="Calibri" w:cs="Calibri" w:eastAsia="Calibri"/>
+          <w:b w:val="0"/>
+          <w:i w:val="0"/>
+          <w:color w:val="222222"/>
+          <w:sz w:val="22"/>
+        </w:rPr>
+        <w:t>Phase 5 fits a multivariable logistic regression with discomfort (any NMQ 12-month pain) as the outcome. The strongest individual predictor is age: each step up in the age band multiplies the odds of discomfort by 3.6 (95% CI 1.70 to 7.56, p = 0.0008). Job duration is next at 2.89 per step (p = 0.001). Education runs the other way as a protective factor (OR 0.33, p = 0.04). Income, fatigue score, workload score, and deliveries per day are all significant at smaller magnitudes. The chi-square test in the same phase finds that Posture and Force are the only two risk factors with a significant association with discomfort in this sample.</w:t>
+      </w:r>
+    </w:p>
+    <w:p>
+      <w:pPr>
+        <w:keepNext/>
+        <w:spacing w:before="320" w:after="80"/>
+      </w:pPr>
+      <w:r>
+        <w:rPr>
+          <w:rFonts w:ascii="Calibri" w:hAnsi="Calibri" w:cs="Calibri" w:eastAsia="Calibri"/>
+          <w:b/>
+          <w:color w:val="1F3B73"/>
+          <w:sz w:val="32"/>
+        </w:rPr>
+        <w:t>The web app</w:t>
+      </w:r>
+    </w:p>
+    <w:p>
+      <w:pPr>
+        <w:spacing w:after="160" w:before="0"/>
+      </w:pPr>
+      <w:r>
+        <w:rPr>
+          <w:rFonts w:ascii="Calibri" w:hAnsi="Calibri" w:cs="Calibri" w:eastAsia="Calibri"/>
+          <w:b w:val="0"/>
+          <w:i w:val="0"/>
+          <w:color w:val="222222"/>
+          <w:sz w:val="22"/>
+        </w:rPr>
+        <w:t>Start it with:</w:t>
+      </w:r>
+    </w:p>
+    <w:p>
+      <w:pPr>
+        <w:spacing w:before="40" w:after="160"/>
         <w:ind w:left="340"/>
       </w:pPr>
       <w:r>
@@ -2726,7 +2034,7 @@
     </w:p>
     <w:p>
       <w:pPr>
-        <w:spacing w:after="120" w:before="0"/>
+        <w:spacing w:after="160" w:before="0"/>
       </w:pPr>
       <w:r>
         <w:rPr>
@@ -2736,90 +2044,12 @@
           <w:color w:val="222222"/>
           <w:sz w:val="22"/>
         </w:rPr>
-        <w:t>Form layout (six sections, single page):</w:t>
+        <w:t>The form has six sections that together cover every column from the CSV and the xlsx. Section 1 is demographics and work pattern, Q1 to Q17. Section 2 is the NMQ 12-month items, the 7-day discomfort items, and the Q20 to Q24 follow-ups. Section 3 is the six NASA-TLX sliders (Q28 was rephrased from 'How satisfied' to 'How dissatisfied' so all six sliders run in the same direction). Section 4 is the six Borg CR10 sliders. Section 5 is the 11 RULA components with help text per item. Section 6 is the 8 QEC scores as number inputs with min/max set to the observed ranges in the training data.</w:t>
       </w:r>
     </w:p>
     <w:p>
       <w:pPr>
-        <w:pStyle w:val="ListBullet"/>
-        <w:spacing w:after="40"/>
-      </w:pPr>
-      <w:r>
-        <w:rPr>
-          <w:rFonts w:ascii="Calibri" w:hAnsi="Calibri" w:cs="Calibri" w:eastAsia="Calibri"/>
-          <w:sz w:val="22"/>
-        </w:rPr>
-        <w:t>Section 1 — Demographic (Q1–17): 17 selectboxes</w:t>
-      </w:r>
-    </w:p>
-    <w:p>
-      <w:pPr>
-        <w:pStyle w:val="ListBullet"/>
-        <w:spacing w:after="40"/>
-      </w:pPr>
-      <w:r>
-        <w:rPr>
-          <w:rFonts w:ascii="Calibri" w:hAnsi="Calibri" w:cs="Calibri" w:eastAsia="Calibri"/>
-          <w:sz w:val="22"/>
-        </w:rPr>
-        <w:t>Section 2 — NMQ + 7-day + outcomes (Q18–24): 18 Yes/No radios</w:t>
-      </w:r>
-    </w:p>
-    <w:p>
-      <w:pPr>
-        <w:pStyle w:val="ListBullet"/>
-        <w:spacing w:after="40"/>
-      </w:pPr>
-      <w:r>
-        <w:rPr>
-          <w:rFonts w:ascii="Calibri" w:hAnsi="Calibri" w:cs="Calibri" w:eastAsia="Calibri"/>
-          <w:sz w:val="22"/>
-        </w:rPr>
-        <w:t>Section 3 — NASA-TLX workload (Q25–30): 6 sliders, 0–100. Q28 phrased as 'DISSATISFIED' so all 6 sliders point in load-direction.</w:t>
-      </w:r>
-    </w:p>
-    <w:p>
-      <w:pPr>
-        <w:pStyle w:val="ListBullet"/>
-        <w:spacing w:after="40"/>
-      </w:pPr>
-      <w:r>
-        <w:rPr>
-          <w:rFonts w:ascii="Calibri" w:hAnsi="Calibri" w:cs="Calibri" w:eastAsia="Calibri"/>
-          <w:sz w:val="22"/>
-        </w:rPr>
-        <w:t>Section 4 — Borg CR10 fatigue (Q31–36): 6 sliders, 0–10</w:t>
-      </w:r>
-    </w:p>
-    <w:p>
-      <w:pPr>
-        <w:pStyle w:val="ListBullet"/>
-        <w:spacing w:after="40"/>
-      </w:pPr>
-      <w:r>
-        <w:rPr>
-          <w:rFonts w:ascii="Calibri" w:hAnsi="Calibri" w:cs="Calibri" w:eastAsia="Calibri"/>
-          <w:sz w:val="22"/>
-        </w:rPr>
-        <w:t>Section 5 — RULA observation: 11 selectboxes with help text per item</w:t>
-      </w:r>
-    </w:p>
-    <w:p>
-      <w:pPr>
-        <w:pStyle w:val="ListBullet"/>
-        <w:spacing w:after="40"/>
-      </w:pPr>
-      <w:r>
-        <w:rPr>
-          <w:rFonts w:ascii="Calibri" w:hAnsi="Calibri" w:cs="Calibri" w:eastAsia="Calibri"/>
-          <w:sz w:val="22"/>
-        </w:rPr>
-        <w:t>Section 6 — Quick Exposure Check (QEC): 8 number_input fields with min/max matched to training-data ranges</w:t>
-      </w:r>
-    </w:p>
-    <w:p>
-      <w:pPr>
-        <w:spacing w:after="120" w:before="0"/>
+        <w:spacing w:after="160" w:before="0"/>
       </w:pPr>
       <w:r>
         <w:rPr>
@@ -2829,27 +2059,27 @@
           <w:color w:val="222222"/>
           <w:sz w:val="22"/>
         </w:rPr>
-        <w:t>encode_rider() converts form values into 63 features (44 survey + 5 interactions + 11 RULA + 8 QEC; specific feature subset selected per model from the saved bundle). predict_risks() loops over the 6 joblib bundles and returns {factor: 'Low'/'Medium'/'High'}. Output rendering: coloured badge table, summary banner, expandable feature-value JSON.</w:t>
+        <w:t>encode_rider() turns the form values into the feature vector each model expects (44 survey features plus 5 interactions plus, for Posture, 11 RULA + 8 QEC). predict_risks() loops over the 6 saved bundles and returns a dict of factor to Low/Medium/High. Output is a colour-coded table with a summary banner; an expandable JSON view shows the exact feature values that were fed in, which is useful for showing a mentor that every form field actually does end up in the prediction.</w:t>
       </w:r>
     </w:p>
     <w:p>
       <w:pPr>
-        <w:keepNext/>
-        <w:spacing w:before="240" w:after="120"/>
+        <w:spacing w:after="160" w:before="0"/>
       </w:pPr>
       <w:r>
         <w:rPr>
           <w:rFonts w:ascii="Calibri" w:hAnsi="Calibri" w:cs="Calibri" w:eastAsia="Calibri"/>
-          <w:b/>
-          <w:color w:val="2E86AB"/>
-          <w:sz w:val="28"/>
+          <w:b w:val="0"/>
+          <w:i w:val="0"/>
+          <w:color w:val="222222"/>
+          <w:sz w:val="22"/>
         </w:rPr>
-        <w:t>Command-line equivalent</w:t>
+        <w:t>The same prediction is also available from the command line:</w:t>
       </w:r>
     </w:p>
     <w:p>
       <w:pPr>
-        <w:spacing w:before="80" w:after="160"/>
+        <w:spacing w:before="40" w:after="160"/>
         <w:ind w:left="340"/>
       </w:pPr>
       <w:r>
@@ -2863,7 +2093,22 @@
     </w:p>
     <w:p>
       <w:pPr>
-        <w:spacing w:after="120" w:before="0"/>
+        <w:keepNext/>
+        <w:spacing w:before="320" w:after="80"/>
+      </w:pPr>
+      <w:r>
+        <w:rPr>
+          <w:rFonts w:ascii="Calibri" w:hAnsi="Calibri" w:cs="Calibri" w:eastAsia="Calibri"/>
+          <w:b/>
+          <w:color w:val="1F3B73"/>
+          <w:sz w:val="32"/>
+        </w:rPr>
+        <w:t>Limitations</w:t>
+      </w:r>
+    </w:p>
+    <w:p>
+      <w:pPr>
+        <w:spacing w:after="160" w:before="0"/>
       </w:pPr>
       <w:r>
         <w:rPr>
@@ -2873,42 +2118,27 @@
           <w:color w:val="222222"/>
           <w:sz w:val="22"/>
         </w:rPr>
-        <w:t>predict.py is generic — it reads bundle['features'] from each saved .pkl and indexes the input dict by those keys. Adding new features requires no change to predict.py.</w:t>
+        <w:t>These should be stated up front rather than buried at the end.</w:t>
       </w:r>
     </w:p>
     <w:p>
       <w:pPr>
         <w:keepNext/>
-        <w:spacing w:before="360" w:after="120"/>
-      </w:pPr>
-      <w:r>
-        <w:rPr>
-          <w:rFonts w:ascii="Calibri" w:hAnsi="Calibri" w:cs="Calibri" w:eastAsia="Calibri"/>
-          <w:b/>
-          <w:color w:val="1F3B73"/>
-          <w:sz w:val="36"/>
-        </w:rPr>
-        <w:t>9. Limitations (disclosed openly)</w:t>
-      </w:r>
-    </w:p>
-    <w:p>
-      <w:pPr>
-        <w:keepNext/>
-        <w:spacing w:before="240" w:after="120"/>
+        <w:spacing w:before="200" w:after="80"/>
       </w:pPr>
       <w:r>
         <w:rPr>
           <w:rFonts w:ascii="Calibri" w:hAnsi="Calibri" w:cs="Calibri" w:eastAsia="Calibri"/>
           <w:b/>
           <w:color w:val="2E86AB"/>
-          <w:sz w:val="28"/>
+          <w:sz w:val="26"/>
         </w:rPr>
-        <w:t>1. Self-report bias</w:t>
+        <w:t>Self-report bias</w:t>
       </w:r>
     </w:p>
     <w:p>
       <w:pPr>
-        <w:spacing w:after="120" w:before="0"/>
+        <w:spacing w:after="160" w:before="0"/>
       </w:pPr>
       <w:r>
         <w:rPr>
@@ -2918,27 +2148,27 @@
           <w:color w:val="222222"/>
           <w:sz w:val="22"/>
         </w:rPr>
-        <w:t>Discomfort, NMQ pain, NASA-TLX workload, and Borg CR10 fatigue are all self-reported. A rider in low mood may report more pain regardless of objective exposure, and vice versa.</w:t>
+        <w:t>Most of the model inputs come from the rider's own answers (NMQ pain, NASA-TLX workload, Borg fatigue, the demographic items). A rider in a bad mood reports more pain than the same rider would on a good day. Nothing in the pipeline can correct for this.</w:t>
       </w:r>
     </w:p>
     <w:p>
       <w:pPr>
         <w:keepNext/>
-        <w:spacing w:before="240" w:after="120"/>
+        <w:spacing w:before="200" w:after="80"/>
       </w:pPr>
       <w:r>
         <w:rPr>
           <w:rFonts w:ascii="Calibri" w:hAnsi="Calibri" w:cs="Calibri" w:eastAsia="Calibri"/>
           <w:b/>
           <w:color w:val="2E86AB"/>
-          <w:sz w:val="28"/>
+          <w:sz w:val="26"/>
         </w:rPr>
-        <w:t>2. Posture per-rider linkage is approximate</w:t>
+        <w:t>The Posture link is approximate</w:t>
       </w:r>
     </w:p>
     <w:p>
       <w:pPr>
-        <w:spacing w:after="120" w:before="0"/>
+        <w:spacing w:after="160" w:before="0"/>
       </w:pPr>
       <w:r>
         <w:rPr>
@@ -2948,27 +2178,27 @@
           <w:color w:val="222222"/>
           <w:sz w:val="22"/>
         </w:rPr>
-        <w:t>The 182 RULA + QEC observation records did not carry a rider identifier. Phase 2 Step 8 ranks riders by an exposure-severity score (NMQ count + fatigue_score + work_hours_num, each normalised) and ranks posture observations by rula_table_c, then merges rank-to-rank. The Posture model's 97% / AUC 98% is therefore the upper bound the linked data permits; an individually-observed cohort would likely score slightly lower because rider-to-observation noise would re-enter.</w:t>
+        <w:t>The 182 RULA + QEC observations do not carry rider identifiers. The Phase 2 Step 8 severity-rank merge pairs them to the survey by ranking riders by exposure severity (NMQ pain count + fatigue + working hours) and posture observations by RULA Table C, then matching the two ranks one to one. This means rider 1 in severity gets observation 1 in RULA, and so on. The 97 percent Posture accuracy is therefore the upper bound of what the linked data can support. A study where every rider is observed individually would settle slightly lower because rider-to-observation noise would re-enter.</w:t>
       </w:r>
     </w:p>
     <w:p>
       <w:pPr>
         <w:keepNext/>
-        <w:spacing w:before="240" w:after="120"/>
+        <w:spacing w:before="200" w:after="80"/>
       </w:pPr>
       <w:r>
         <w:rPr>
           <w:rFonts w:ascii="Calibri" w:hAnsi="Calibri" w:cs="Calibri" w:eastAsia="Calibri"/>
           <w:b/>
           <w:color w:val="2E86AB"/>
-          <w:sz w:val="28"/>
+          <w:sz w:val="26"/>
         </w:rPr>
-        <w:t>3. Repetition binning was identified and corrected</w:t>
+        <w:t>Repetition binning fix</w:t>
       </w:r>
     </w:p>
     <w:p>
       <w:pPr>
-        <w:spacing w:after="120" w:before="0"/>
+        <w:spacing w:after="160" w:before="0"/>
       </w:pPr>
       <w:r>
         <w:rPr>
@@ -2978,27 +2208,27 @@
           <w:color w:val="222222"/>
           <w:sz w:val="22"/>
         </w:rPr>
-        <w:t>Phase 3 originally binned Repetition via pd.qcut(q=3) on deliveries_per_hour. The Medium/High tercile edge landed exactly on 3.889 dph (= 35 / 9), and 55 of 182 riders tied at that value. pd.qcut is right-inclusive, so all 55 fell into Medium, and the Stage-2 ML model could never predict High for a max-input rider. Fix: pd.cut with fixed bins [-0.01, 2.5, 3.75, max+0.01]. Stage-1 High count rose from 19 to 74; Stage-2 accuracy fell from 74% to 62%. The lower number is more honest because the model is now solving a real 3-class problem.</w:t>
+        <w:t>The earlier Phase 3 used pandas qcut(q=3) on deliveries_per_hour. The 75th percentile fell exactly on 3.889 dph (= 35 deliveries / 9 hours), which is the worst real combination in the sample. 55 of 182 riders tied at that value and were all binned into Medium because qcut is right-inclusive at the upper edge. The Stage-2 model could never predict High for the worst real rider, no matter what features it was given. The fix replaces qcut with fixed cuts at 2.5 and 3.75 so the worst case ends up in High where it should. Stage-1 High count went from 19 to 74. Stage-2 accuracy went from 74 percent to 62 percent. The drop is the honest trade: the model is now learning a real High class of 74 examples instead of memorising a 19-example minority.</w:t>
       </w:r>
     </w:p>
     <w:p>
       <w:pPr>
         <w:keepNext/>
-        <w:spacing w:before="240" w:after="120"/>
+        <w:spacing w:before="200" w:after="80"/>
       </w:pPr>
       <w:r>
         <w:rPr>
           <w:rFonts w:ascii="Calibri" w:hAnsi="Calibri" w:cs="Calibri" w:eastAsia="Calibri"/>
           <w:b/>
           <w:color w:val="2E86AB"/>
-          <w:sz w:val="28"/>
+          <w:sz w:val="26"/>
         </w:rPr>
-        <w:t>4. Duration leakage was identified and corrected</w:t>
+        <w:t>Duration leakage fix</w:t>
       </w:r>
     </w:p>
     <w:p>
       <w:pPr>
-        <w:spacing w:after="120" w:before="0"/>
+        <w:spacing w:after="160" w:before="0"/>
       </w:pPr>
       <w:r>
         <w:rPr>
@@ -3008,27 +2238,27 @@
           <w:color w:val="222222"/>
           <w:sz w:val="22"/>
         </w:rPr>
-        <w:t>An earlier Phase 6 run reported 100% CV accuracy for Duration. Even with work_hours_num excluded, the trees recovered the label from vibration_index (= vehicle_rank × work_hours_num). Fix: added vibration_index to the Duration exclusion list and capped max_depth + min_samples_leaf. Duration settled at a realistic 61% / AUC 76%.</w:t>
+        <w:t>An earlier Phase 6 run reported 100 percent CV accuracy on Duration. After investigating we found that vibration_index (= vehicle_rank x work_hours_num) was still in the feature pool, so the trees were recovering work_hours_num from it. We added vibration_index to the Duration exclusion list and capped max_depth + min_samples_leaf. Duration settled at 61 percent accuracy and 76 percent AUC.</w:t>
       </w:r>
     </w:p>
     <w:p>
       <w:pPr>
         <w:keepNext/>
-        <w:spacing w:before="240" w:after="120"/>
+        <w:spacing w:before="200" w:after="80"/>
       </w:pPr>
       <w:r>
         <w:rPr>
           <w:rFonts w:ascii="Calibri" w:hAnsi="Calibri" w:cs="Calibri" w:eastAsia="Calibri"/>
           <w:b/>
           <w:color w:val="2E86AB"/>
-          <w:sz w:val="28"/>
+          <w:sz w:val="26"/>
         </w:rPr>
-        <w:t>5. Cross-sectional design</w:t>
+        <w:t>Cross-sectional design</w:t>
       </w:r>
     </w:p>
     <w:p>
       <w:pPr>
-        <w:spacing w:after="120" w:before="0"/>
+        <w:spacing w:after="160" w:before="0"/>
       </w:pPr>
       <w:r>
         <w:rPr>
@@ -3038,27 +2268,27 @@
           <w:color w:val="222222"/>
           <w:sz w:val="22"/>
         </w:rPr>
-        <w:t>No causal inference is possible. Older riders report more pain, but we cannot tell whether long delivery careers cause MSDs or whether riders with MSDs self-select out at younger ages.</w:t>
+        <w:t>Each rider was surveyed once. The fact that older riders report more pain could mean that long delivery careers cause MSDs, or that riders who develop MSDs quit, leaving the survivors. A follow-up study would settle this.</w:t>
       </w:r>
     </w:p>
     <w:p>
       <w:pPr>
         <w:keepNext/>
-        <w:spacing w:before="240" w:after="120"/>
+        <w:spacing w:before="200" w:after="80"/>
       </w:pPr>
       <w:r>
         <w:rPr>
           <w:rFonts w:ascii="Calibri" w:hAnsi="Calibri" w:cs="Calibri" w:eastAsia="Calibri"/>
           <w:b/>
           <w:color w:val="2E86AB"/>
-          <w:sz w:val="28"/>
+          <w:sz w:val="26"/>
         </w:rPr>
-        <w:t>6. Sample size and geography</w:t>
+        <w:t>Sample size and region</w:t>
       </w:r>
     </w:p>
     <w:p>
       <w:pPr>
-        <w:spacing w:after="120" w:before="0"/>
+        <w:spacing w:after="160" w:before="0"/>
       </w:pPr>
       <w:r>
         <w:rPr>
@@ -3068,27 +2298,27 @@
           <w:color w:val="222222"/>
           <w:sz w:val="22"/>
         </w:rPr>
-        <w:t>n = 182 is reasonable for descriptive epidemiology but small for multivariable ML; CV variance is ~5 percentage points. All riders were drawn from a single regional platform deployment, so findings may not generalise.</w:t>
+        <w:t>n = 182 is reasonable for descriptive statistics but small for multivariable ML; the cross-validation results have a natural wobble of around 5 percentage points. All riders came from one regional platform deployment, so the numbers may not transfer to other regions.</w:t>
       </w:r>
     </w:p>
     <w:p>
       <w:pPr>
         <w:keepNext/>
-        <w:spacing w:before="240" w:after="120"/>
+        <w:spacing w:before="200" w:after="80"/>
       </w:pPr>
       <w:r>
         <w:rPr>
           <w:rFonts w:ascii="Calibri" w:hAnsi="Calibri" w:cs="Calibri" w:eastAsia="Calibri"/>
           <w:b/>
           <w:color w:val="2E86AB"/>
-          <w:sz w:val="28"/>
+          <w:sz w:val="26"/>
         </w:rPr>
-        <w:t>7. Proxies for Vibration and Repetition</w:t>
+        <w:t>Proxy inputs for Vibration and Repetition</w:t>
       </w:r>
     </w:p>
     <w:p>
       <w:pPr>
-        <w:spacing w:after="120" w:before="0"/>
+        <w:spacing w:after="160" w:before="0"/>
       </w:pPr>
       <w:r>
         <w:rPr>
@@ -3098,27 +2328,27 @@
           <w:color w:val="222222"/>
           <w:sz w:val="22"/>
         </w:rPr>
-        <w:t>Without per-shift ISO-2631 accelerometer data, Vibration is approximated as vehicle_rank × work_hours_num. Without per-task timing, Repetition is approximated as deliveries-per-hour. Both proxies map directly onto the survey the riders filled in, but they do not capture the per-event signal a wearable would produce.</w:t>
+        <w:t>Without per-shift accelerometer data, Vibration is approximated as vehicle_rank x work_hours_num. Without per-task timing, Repetition is approximated as deliveries-per-hour. Both proxies map onto what the survey can capture but neither carries the per-event signal a wearable would.</w:t>
       </w:r>
     </w:p>
     <w:p>
       <w:pPr>
         <w:keepNext/>
-        <w:spacing w:before="240" w:after="120"/>
+        <w:spacing w:before="320" w:after="80"/>
       </w:pPr>
       <w:r>
         <w:rPr>
           <w:rFonts w:ascii="Calibri" w:hAnsi="Calibri" w:cs="Calibri" w:eastAsia="Calibri"/>
           <w:b/>
-          <w:color w:val="2E86AB"/>
-          <w:sz w:val="28"/>
+          <w:color w:val="1F3B73"/>
+          <w:sz w:val="32"/>
         </w:rPr>
-        <w:t>8. No follow-up</w:t>
+        <w:t>Recommendations</w:t>
       </w:r>
     </w:p>
     <w:p>
       <w:pPr>
-        <w:spacing w:after="120" w:before="0"/>
+        <w:spacing w:after="160" w:before="0"/>
       </w:pPr>
       <w:r>
         <w:rPr>
@@ -3128,1499 +2358,27 @@
           <w:color w:val="222222"/>
           <w:sz w:val="22"/>
         </w:rPr>
-        <w:t>A longitudinal design would let us test whether riders flagged as High today develop more pain over time. This study is cross-sectional only.</w:t>
+        <w:t>Five interventions come out of the analysis, ordered by how many riders they would reach. First, cap daily hours. Roughly half the sample works more than 8 hours per day, so a shift-length cap has the biggest population reach. Second, posture training and equipment review: 84 percent of observed postures sit at RULA action level 5 or above, which usually means handle grips, helmet ergonomics, seat adjustment, or bag strap design. Third, push for storage-box carrying over handheld bags because the storage-box riders in the sample had the lowest contact stress. Fourth, age-targeted screening: discomfort climbs from 72 percent in riders under 25 to 100 percent in those 46 and above, so an annual MSD screen for the 36-plus cohort would catch problems earlier. Fifth, workload management at the platform level: smoother route batching and fewer 'rush' window pushes would reduce NASA-TLX scores and, through that channel, predicted risk.</w:t>
       </w:r>
     </w:p>
     <w:p>
       <w:pPr>
         <w:keepNext/>
-        <w:spacing w:before="360" w:after="120"/>
+        <w:spacing w:before="320" w:after="80"/>
       </w:pPr>
       <w:r>
         <w:rPr>
           <w:rFonts w:ascii="Calibri" w:hAnsi="Calibri" w:cs="Calibri" w:eastAsia="Calibri"/>
           <w:b/>
           <w:color w:val="1F3B73"/>
-          <w:sz w:val="36"/>
+          <w:sz w:val="32"/>
         </w:rPr>
-        <w:t>10. Frequently asked questions</w:t>
+        <w:t>Where things live in the repository</w:t>
       </w:r>
     </w:p>
     <w:p>
       <w:pPr>
-        <w:keepNext/>
-        <w:spacing w:before="240" w:after="120"/>
-      </w:pPr>
-      <w:r>
-        <w:rPr>
-          <w:rFonts w:ascii="Calibri" w:hAnsi="Calibri" w:cs="Calibri" w:eastAsia="Calibri"/>
-          <w:b/>
-          <w:color w:val="2E86AB"/>
-          <w:sz w:val="28"/>
-        </w:rPr>
-        <w:t>Q. Why is Posture 97% accurate when the others are 58–62%?</w:t>
-      </w:r>
-    </w:p>
-    <w:p>
-      <w:pPr>
-        <w:spacing w:after="120" w:before="0"/>
-      </w:pPr>
-      <w:r>
-        <w:rPr>
-          <w:rFonts w:ascii="Calibri" w:hAnsi="Calibri" w:cs="Calibri" w:eastAsia="Calibri"/>
-          <w:b w:val="0"/>
-          <w:i w:val="0"/>
-          <w:color w:val="222222"/>
-          <w:sz w:val="22"/>
-        </w:rPr>
-        <w:t>A. Posture is the only model that receives direct ergonomic observation inputs — the 11 RULA components and 8 QEC scores. The other 5 models have survey features only, and each one excludes the variable that defines its own target (force_exertion for Force, deliveries_num + work_hours_num for Repetition, etc.) to prevent trivial leakage. Predicting a deterministic label from survey proxies is structurally harder than fitting a near-deterministic RULA lookup table.</w:t>
-      </w:r>
-    </w:p>
-    <w:p>
-      <w:pPr>
-        <w:keepNext/>
-        <w:spacing w:before="240" w:after="120"/>
-      </w:pPr>
-      <w:r>
-        <w:rPr>
-          <w:rFonts w:ascii="Calibri" w:hAnsi="Calibri" w:cs="Calibri" w:eastAsia="Calibri"/>
-          <w:b/>
-          <w:color w:val="2E86AB"/>
-          <w:sz w:val="28"/>
-        </w:rPr>
-        <w:t>Q. Is 58–62% accuracy acceptable?</w:t>
-      </w:r>
-    </w:p>
-    <w:p>
-      <w:pPr>
-        <w:spacing w:after="120" w:before="0"/>
-      </w:pPr>
-      <w:r>
-        <w:rPr>
-          <w:rFonts w:ascii="Calibri" w:hAnsi="Calibri" w:cs="Calibri" w:eastAsia="Calibri"/>
-          <w:b w:val="0"/>
-          <w:i w:val="0"/>
-          <w:color w:val="222222"/>
-          <w:sz w:val="22"/>
-        </w:rPr>
-        <w:t>A. It is the realistic ceiling once each factor's defining input is excluded to prevent leakage. Macro AUC at 71–76% confirms the models still rank riders correctly even when they don't always assign the exact class. A sensor-instrumented pipeline (IMU, EMG, wearable) would do better but is out of scope here.</w:t>
-      </w:r>
-    </w:p>
-    <w:p>
-      <w:pPr>
-        <w:keepNext/>
-        <w:spacing w:before="240" w:after="120"/>
-      </w:pPr>
-      <w:r>
-        <w:rPr>
-          <w:rFonts w:ascii="Calibri" w:hAnsi="Calibri" w:cs="Calibri" w:eastAsia="Calibri"/>
-          <w:b/>
-          <w:color w:val="2E86AB"/>
-          <w:sz w:val="28"/>
-        </w:rPr>
-        <w:t>Q. Could a delivery platform actually deploy this?</w:t>
-      </w:r>
-    </w:p>
-    <w:p>
-      <w:pPr>
-        <w:spacing w:after="120" w:before="0"/>
-      </w:pPr>
-      <w:r>
-        <w:rPr>
-          <w:rFonts w:ascii="Calibri" w:hAnsi="Calibri" w:cs="Calibri" w:eastAsia="Calibri"/>
-          <w:b w:val="0"/>
-          <w:i w:val="0"/>
-          <w:color w:val="222222"/>
-          <w:sz w:val="22"/>
-        </w:rPr>
-        <w:t>A. Yes — as a screening tool. Each rider fills the survey at onboarding and annually; the 5 survey-derived risk factors run automatically. Posture requires an ergonomic-trained observer to complete the RULA + QEC worksheets, which is a per-rider cost the platform decides whether to pay.</w:t>
-      </w:r>
-    </w:p>
-    <w:p>
-      <w:pPr>
-        <w:keepNext/>
-        <w:spacing w:before="240" w:after="120"/>
-      </w:pPr>
-      <w:r>
-        <w:rPr>
-          <w:rFonts w:ascii="Calibri" w:hAnsi="Calibri" w:cs="Calibri" w:eastAsia="Calibri"/>
-          <w:b/>
-          <w:color w:val="2E86AB"/>
-          <w:sz w:val="28"/>
-        </w:rPr>
-        <w:t>Q. What if a rider lies on the survey?</w:t>
-      </w:r>
-    </w:p>
-    <w:p>
-      <w:pPr>
-        <w:spacing w:after="120" w:before="0"/>
-      </w:pPr>
-      <w:r>
-        <w:rPr>
-          <w:rFonts w:ascii="Calibri" w:hAnsi="Calibri" w:cs="Calibri" w:eastAsia="Calibri"/>
-          <w:b w:val="0"/>
-          <w:i w:val="0"/>
-          <w:color w:val="222222"/>
-          <w:sz w:val="22"/>
-        </w:rPr>
-        <w:t>A. Self-report is biased by definition. The model cannot detect dishonesty. This is acknowledged in Limitation #1.</w:t>
-      </w:r>
-    </w:p>
-    <w:p>
-      <w:pPr>
-        <w:keepNext/>
-        <w:spacing w:before="240" w:after="120"/>
-      </w:pPr>
-      <w:r>
-        <w:rPr>
-          <w:rFonts w:ascii="Calibri" w:hAnsi="Calibri" w:cs="Calibri" w:eastAsia="Calibri"/>
-          <w:b/>
-          <w:color w:val="2E86AB"/>
-          <w:sz w:val="28"/>
-        </w:rPr>
-        <w:t>Q. Why so many features for Posture (63) and so few for the rest (41–42)?</w:t>
-      </w:r>
-    </w:p>
-    <w:p>
-      <w:pPr>
-        <w:spacing w:after="120" w:before="0"/>
-      </w:pPr>
-      <w:r>
-        <w:rPr>
-          <w:rFonts w:ascii="Calibri" w:hAnsi="Calibri" w:cs="Calibri" w:eastAsia="Calibri"/>
-          <w:b w:val="0"/>
-          <w:i w:val="0"/>
-          <w:color w:val="222222"/>
-          <w:sz w:val="22"/>
-        </w:rPr>
-        <w:t>A. The survey feature_pool is 44 features. For Force, Repetition, Duration, Vibration, Contact Stress we drop 2–3 features that directly define the target (anti-leakage). Posture additionally takes the 11 RULA components and 8 QEC scores from the xlsx, giving 63.</w:t>
-      </w:r>
-    </w:p>
-    <w:p>
-      <w:pPr>
-        <w:keepNext/>
-        <w:spacing w:before="240" w:after="120"/>
-      </w:pPr>
-      <w:r>
-        <w:rPr>
-          <w:rFonts w:ascii="Calibri" w:hAnsi="Calibri" w:cs="Calibri" w:eastAsia="Calibri"/>
-          <w:b/>
-          <w:color w:val="2E86AB"/>
-          <w:sz w:val="28"/>
-        </w:rPr>
-        <w:t>Q. Is the pipeline reproducible?</w:t>
-      </w:r>
-    </w:p>
-    <w:p>
-      <w:pPr>
-        <w:spacing w:after="120" w:before="0"/>
-      </w:pPr>
-      <w:r>
-        <w:rPr>
-          <w:rFonts w:ascii="Calibri" w:hAnsi="Calibri" w:cs="Calibri" w:eastAsia="Calibri"/>
-          <w:b w:val="0"/>
-          <w:i w:val="0"/>
-          <w:color w:val="222222"/>
-          <w:sz w:val="22"/>
-        </w:rPr>
-        <w:t>A. Yes — fixed random seed (RNG = 42), StratifiedKFold(5, shuffle=True, random_state=42), GridSearchCV with refit=False then explicit refit. Running the 7 notebooks in order regenerates every saved artefact identically.</w:t>
-      </w:r>
-    </w:p>
-    <w:p>
-      <w:pPr>
-        <w:keepNext/>
-        <w:spacing w:before="360" w:after="120"/>
-      </w:pPr>
-      <w:r>
-        <w:rPr>
-          <w:rFonts w:ascii="Calibri" w:hAnsi="Calibri" w:cs="Calibri" w:eastAsia="Calibri"/>
-          <w:b/>
-          <w:color w:val="1F3B73"/>
-          <w:sz w:val="36"/>
-        </w:rPr>
-        <w:t>11. Glossary</w:t>
-      </w:r>
-    </w:p>
-    <w:p>
-      <w:pPr>
-        <w:spacing w:after="120" w:before="0"/>
-      </w:pPr>
-      <w:r>
-        <w:rPr>
-          <w:rFonts w:ascii="Calibri" w:hAnsi="Calibri" w:cs="Calibri" w:eastAsia="Calibri"/>
-          <w:b w:val="0"/>
-          <w:i/>
-          <w:color w:val="555555"/>
-          <w:sz w:val="22"/>
-        </w:rPr>
-        <w:t>Every technical term used in this project, listed alphabetically.</w:t>
-      </w:r>
-    </w:p>
-    <w:p>
-      <w:pPr>
-        <w:spacing w:after="80"/>
-      </w:pPr>
-      <w:r>
-        <w:rPr>
-          <w:rFonts w:ascii="Calibri" w:hAnsi="Calibri" w:cs="Calibri" w:eastAsia="Calibri"/>
-          <w:b/>
-          <w:color w:val="1F3B73"/>
-          <w:sz w:val="22"/>
-        </w:rPr>
-        <w:t>AUC</w:t>
-      </w:r>
-      <w:r>
-        <w:rPr>
-          <w:rFonts w:ascii="Calibri" w:hAnsi="Calibri" w:cs="Calibri" w:eastAsia="Calibri"/>
-          <w:color w:val="555555"/>
-          <w:sz w:val="22"/>
-        </w:rPr>
-        <w:t xml:space="preserve">  —  </w:t>
-      </w:r>
-      <w:r>
-        <w:rPr>
-          <w:rFonts w:ascii="Calibri" w:hAnsi="Calibri" w:cs="Calibri" w:eastAsia="Calibri"/>
-          <w:sz w:val="22"/>
-        </w:rPr>
-        <w:t>Area Under the ROC Curve. 0.5 = no skill, 1.0 = perfect ranking. Reported as macro-averaged across classes.</w:t>
-      </w:r>
-    </w:p>
-    <w:p>
-      <w:pPr>
-        <w:spacing w:after="80"/>
-      </w:pPr>
-      <w:r>
-        <w:rPr>
-          <w:rFonts w:ascii="Calibri" w:hAnsi="Calibri" w:cs="Calibri" w:eastAsia="Calibri"/>
-          <w:b/>
-          <w:color w:val="1F3B73"/>
-          <w:sz w:val="22"/>
-        </w:rPr>
-        <w:t>Borg CR10</w:t>
-      </w:r>
-      <w:r>
-        <w:rPr>
-          <w:rFonts w:ascii="Calibri" w:hAnsi="Calibri" w:cs="Calibri" w:eastAsia="Calibri"/>
-          <w:color w:val="555555"/>
-          <w:sz w:val="22"/>
-        </w:rPr>
-        <w:t xml:space="preserve">  —  </w:t>
-      </w:r>
-      <w:r>
-        <w:rPr>
-          <w:rFonts w:ascii="Calibri" w:hAnsi="Calibri" w:cs="Calibri" w:eastAsia="Calibri"/>
-          <w:sz w:val="22"/>
-        </w:rPr>
-        <w:t>Standard 0–10 category-ratio scale for perceived exertion. Action levels: 0–3 = acceptable, 4–6 = monitor, 7–10 = intervene.</w:t>
-      </w:r>
-    </w:p>
-    <w:p>
-      <w:pPr>
-        <w:spacing w:after="80"/>
-      </w:pPr>
-      <w:r>
-        <w:rPr>
-          <w:rFonts w:ascii="Calibri" w:hAnsi="Calibri" w:cs="Calibri" w:eastAsia="Calibri"/>
-          <w:b/>
-          <w:color w:val="1F3B73"/>
-          <w:sz w:val="22"/>
-        </w:rPr>
-        <w:t>Classifier</w:t>
-      </w:r>
-      <w:r>
-        <w:rPr>
-          <w:rFonts w:ascii="Calibri" w:hAnsi="Calibri" w:cs="Calibri" w:eastAsia="Calibri"/>
-          <w:color w:val="555555"/>
-          <w:sz w:val="22"/>
-        </w:rPr>
-        <w:t xml:space="preserve">  —  </w:t>
-      </w:r>
-      <w:r>
-        <w:rPr>
-          <w:rFonts w:ascii="Calibri" w:hAnsi="Calibri" w:cs="Calibri" w:eastAsia="Calibri"/>
-          <w:sz w:val="22"/>
-        </w:rPr>
-        <w:t>Supervised model that predicts a categorical label.</w:t>
-      </w:r>
-    </w:p>
-    <w:p>
-      <w:pPr>
-        <w:spacing w:after="80"/>
-      </w:pPr>
-      <w:r>
-        <w:rPr>
-          <w:rFonts w:ascii="Calibri" w:hAnsi="Calibri" w:cs="Calibri" w:eastAsia="Calibri"/>
-          <w:b/>
-          <w:color w:val="1F3B73"/>
-          <w:sz w:val="22"/>
-        </w:rPr>
-        <w:t>Confusion matrix</w:t>
-      </w:r>
-      <w:r>
-        <w:rPr>
-          <w:rFonts w:ascii="Calibri" w:hAnsi="Calibri" w:cs="Calibri" w:eastAsia="Calibri"/>
-          <w:color w:val="555555"/>
-          <w:sz w:val="22"/>
-        </w:rPr>
-        <w:t xml:space="preserve">  —  </w:t>
-      </w:r>
-      <w:r>
-        <w:rPr>
-          <w:rFonts w:ascii="Calibri" w:hAnsi="Calibri" w:cs="Calibri" w:eastAsia="Calibri"/>
-          <w:sz w:val="22"/>
-        </w:rPr>
-        <w:t>n × n table where row i = true class i, col j = predicted class j. Diagonal cells are correct predictions.</w:t>
-      </w:r>
-    </w:p>
-    <w:p>
-      <w:pPr>
-        <w:spacing w:after="80"/>
-      </w:pPr>
-      <w:r>
-        <w:rPr>
-          <w:rFonts w:ascii="Calibri" w:hAnsi="Calibri" w:cs="Calibri" w:eastAsia="Calibri"/>
-          <w:b/>
-          <w:color w:val="1F3B73"/>
-          <w:sz w:val="22"/>
-        </w:rPr>
-        <w:t>cross_val_predict</w:t>
-      </w:r>
-      <w:r>
-        <w:rPr>
-          <w:rFonts w:ascii="Calibri" w:hAnsi="Calibri" w:cs="Calibri" w:eastAsia="Calibri"/>
-          <w:color w:val="555555"/>
-          <w:sz w:val="22"/>
-        </w:rPr>
-        <w:t xml:space="preserve">  —  </w:t>
-      </w:r>
-      <w:r>
-        <w:rPr>
-          <w:rFonts w:ascii="Calibri" w:hAnsi="Calibri" w:cs="Calibri" w:eastAsia="Calibri"/>
-          <w:sz w:val="22"/>
-        </w:rPr>
-        <w:t>scikit-learn function that returns out-of-fold predictions for every row — used in Phase 7 to compute honest confusion matrices.</w:t>
-      </w:r>
-    </w:p>
-    <w:p>
-      <w:pPr>
-        <w:spacing w:after="80"/>
-      </w:pPr>
-      <w:r>
-        <w:rPr>
-          <w:rFonts w:ascii="Calibri" w:hAnsi="Calibri" w:cs="Calibri" w:eastAsia="Calibri"/>
-          <w:b/>
-          <w:color w:val="1F3B73"/>
-          <w:sz w:val="22"/>
-        </w:rPr>
-        <w:t>Cross-validation (5-fold)</w:t>
-      </w:r>
-      <w:r>
-        <w:rPr>
-          <w:rFonts w:ascii="Calibri" w:hAnsi="Calibri" w:cs="Calibri" w:eastAsia="Calibri"/>
-          <w:color w:val="555555"/>
-          <w:sz w:val="22"/>
-        </w:rPr>
-        <w:t xml:space="preserve">  —  </w:t>
-      </w:r>
-      <w:r>
-        <w:rPr>
-          <w:rFonts w:ascii="Calibri" w:hAnsi="Calibri" w:cs="Calibri" w:eastAsia="Calibri"/>
-          <w:sz w:val="22"/>
-        </w:rPr>
-        <w:t>Partition the data into 5 stratified folds; train on 4 and score on the 5th; repeat 5 times; report mean and std of scores.</w:t>
-      </w:r>
-    </w:p>
-    <w:p>
-      <w:pPr>
-        <w:spacing w:after="80"/>
-      </w:pPr>
-      <w:r>
-        <w:rPr>
-          <w:rFonts w:ascii="Calibri" w:hAnsi="Calibri" w:cs="Calibri" w:eastAsia="Calibri"/>
-          <w:b/>
-          <w:color w:val="1F3B73"/>
-          <w:sz w:val="22"/>
-        </w:rPr>
-        <w:t>CV accuracy</w:t>
-      </w:r>
-      <w:r>
-        <w:rPr>
-          <w:rFonts w:ascii="Calibri" w:hAnsi="Calibri" w:cs="Calibri" w:eastAsia="Calibri"/>
-          <w:color w:val="555555"/>
-          <w:sz w:val="22"/>
-        </w:rPr>
-        <w:t xml:space="preserve">  —  </w:t>
-      </w:r>
-      <w:r>
-        <w:rPr>
-          <w:rFonts w:ascii="Calibri" w:hAnsi="Calibri" w:cs="Calibri" w:eastAsia="Calibri"/>
-          <w:sz w:val="22"/>
-        </w:rPr>
-        <w:t>Mean test-fold accuracy across 5 CV folds.</w:t>
-      </w:r>
-    </w:p>
-    <w:p>
-      <w:pPr>
-        <w:spacing w:after="80"/>
-      </w:pPr>
-      <w:r>
-        <w:rPr>
-          <w:rFonts w:ascii="Calibri" w:hAnsi="Calibri" w:cs="Calibri" w:eastAsia="Calibri"/>
-          <w:b/>
-          <w:color w:val="1F3B73"/>
-          <w:sz w:val="22"/>
-        </w:rPr>
-        <w:t>CV F1 macro</w:t>
-      </w:r>
-      <w:r>
-        <w:rPr>
-          <w:rFonts w:ascii="Calibri" w:hAnsi="Calibri" w:cs="Calibri" w:eastAsia="Calibri"/>
-          <w:color w:val="555555"/>
-          <w:sz w:val="22"/>
-        </w:rPr>
-        <w:t xml:space="preserve">  —  </w:t>
-      </w:r>
-      <w:r>
-        <w:rPr>
-          <w:rFonts w:ascii="Calibri" w:hAnsi="Calibri" w:cs="Calibri" w:eastAsia="Calibri"/>
-          <w:sz w:val="22"/>
-        </w:rPr>
-        <w:t>Mean test-fold macro-averaged F1 across 5 CV folds.</w:t>
-      </w:r>
-    </w:p>
-    <w:p>
-      <w:pPr>
-        <w:spacing w:after="80"/>
-      </w:pPr>
-      <w:r>
-        <w:rPr>
-          <w:rFonts w:ascii="Calibri" w:hAnsi="Calibri" w:cs="Calibri" w:eastAsia="Calibri"/>
-          <w:b/>
-          <w:color w:val="1F3B73"/>
-          <w:sz w:val="22"/>
-        </w:rPr>
-        <w:t>Decision Tree</w:t>
-      </w:r>
-      <w:r>
-        <w:rPr>
-          <w:rFonts w:ascii="Calibri" w:hAnsi="Calibri" w:cs="Calibri" w:eastAsia="Calibri"/>
-          <w:color w:val="555555"/>
-          <w:sz w:val="22"/>
-        </w:rPr>
-        <w:t xml:space="preserve">  —  </w:t>
-      </w:r>
-      <w:r>
-        <w:rPr>
-          <w:rFonts w:ascii="Calibri" w:hAnsi="Calibri" w:cs="Calibri" w:eastAsia="Calibri"/>
-          <w:sz w:val="22"/>
-        </w:rPr>
-        <w:t>Recursive binary partitioning learner. Highly interpretable, tends to overfit on small samples.</w:t>
-      </w:r>
-    </w:p>
-    <w:p>
-      <w:pPr>
-        <w:spacing w:after="80"/>
-      </w:pPr>
-      <w:r>
-        <w:rPr>
-          <w:rFonts w:ascii="Calibri" w:hAnsi="Calibri" w:cs="Calibri" w:eastAsia="Calibri"/>
-          <w:b/>
-          <w:color w:val="1F3B73"/>
-          <w:sz w:val="22"/>
-        </w:rPr>
-        <w:t>Discomfort</w:t>
-      </w:r>
-      <w:r>
-        <w:rPr>
-          <w:rFonts w:ascii="Calibri" w:hAnsi="Calibri" w:cs="Calibri" w:eastAsia="Calibri"/>
-          <w:color w:val="555555"/>
-          <w:sz w:val="22"/>
-        </w:rPr>
-        <w:t xml:space="preserve">  —  </w:t>
-      </w:r>
-      <w:r>
-        <w:rPr>
-          <w:rFonts w:ascii="Calibri" w:hAnsi="Calibri" w:cs="Calibri" w:eastAsia="Calibri"/>
-          <w:sz w:val="22"/>
-        </w:rPr>
-        <w:t>Binary target = 1 if any of the 9 NMQ 12-month items = Yes, else 0. Outcome variable for Phase 5 statistics.</w:t>
-      </w:r>
-    </w:p>
-    <w:p>
-      <w:pPr>
-        <w:spacing w:after="80"/>
-      </w:pPr>
-      <w:r>
-        <w:rPr>
-          <w:rFonts w:ascii="Calibri" w:hAnsi="Calibri" w:cs="Calibri" w:eastAsia="Calibri"/>
-          <w:b/>
-          <w:color w:val="1F3B73"/>
-          <w:sz w:val="22"/>
-        </w:rPr>
-        <w:t>ExtraTrees / ExtraTreesClassifier</w:t>
-      </w:r>
-      <w:r>
-        <w:rPr>
-          <w:rFonts w:ascii="Calibri" w:hAnsi="Calibri" w:cs="Calibri" w:eastAsia="Calibri"/>
-          <w:color w:val="555555"/>
-          <w:sz w:val="22"/>
-        </w:rPr>
-        <w:t xml:space="preserve">  —  </w:t>
-      </w:r>
-      <w:r>
-        <w:rPr>
-          <w:rFonts w:ascii="Calibri" w:hAnsi="Calibri" w:cs="Calibri" w:eastAsia="Calibri"/>
-          <w:sz w:val="22"/>
-        </w:rPr>
-        <w:t>Extremely randomised trees ensemble. Like Random Forest but uses random split thresholds, reducing variance further.</w:t>
-      </w:r>
-    </w:p>
-    <w:p>
-      <w:pPr>
-        <w:spacing w:after="80"/>
-      </w:pPr>
-      <w:r>
-        <w:rPr>
-          <w:rFonts w:ascii="Calibri" w:hAnsi="Calibri" w:cs="Calibri" w:eastAsia="Calibri"/>
-          <w:b/>
-          <w:color w:val="1F3B73"/>
-          <w:sz w:val="22"/>
-        </w:rPr>
-        <w:t>Feature importance</w:t>
-      </w:r>
-      <w:r>
-        <w:rPr>
-          <w:rFonts w:ascii="Calibri" w:hAnsi="Calibri" w:cs="Calibri" w:eastAsia="Calibri"/>
-          <w:color w:val="555555"/>
-          <w:sz w:val="22"/>
-        </w:rPr>
-        <w:t xml:space="preserve">  —  </w:t>
-      </w:r>
-      <w:r>
-        <w:rPr>
-          <w:rFonts w:ascii="Calibri" w:hAnsi="Calibri" w:cs="Calibri" w:eastAsia="Calibri"/>
-          <w:sz w:val="22"/>
-        </w:rPr>
-        <w:t>Tree-based: mean decrease in impurity per feature. Linear: absolute coefficient magnitude.</w:t>
-      </w:r>
-    </w:p>
-    <w:p>
-      <w:pPr>
-        <w:spacing w:after="80"/>
-      </w:pPr>
-      <w:r>
-        <w:rPr>
-          <w:rFonts w:ascii="Calibri" w:hAnsi="Calibri" w:cs="Calibri" w:eastAsia="Calibri"/>
-          <w:b/>
-          <w:color w:val="1F3B73"/>
-          <w:sz w:val="22"/>
-        </w:rPr>
-        <w:t>Feature pool</w:t>
-      </w:r>
-      <w:r>
-        <w:rPr>
-          <w:rFonts w:ascii="Calibri" w:hAnsi="Calibri" w:cs="Calibri" w:eastAsia="Calibri"/>
-          <w:color w:val="555555"/>
-          <w:sz w:val="22"/>
-        </w:rPr>
-        <w:t xml:space="preserve">  —  </w:t>
-      </w:r>
-      <w:r>
-        <w:rPr>
-          <w:rFonts w:ascii="Calibri" w:hAnsi="Calibri" w:cs="Calibri" w:eastAsia="Calibri"/>
-          <w:sz w:val="22"/>
-        </w:rPr>
-        <w:t>The full list of candidate features available to a target. Per-target exclusions remove inputs that define the target (anti-leakage).</w:t>
-      </w:r>
-    </w:p>
-    <w:p>
-      <w:pPr>
-        <w:spacing w:after="80"/>
-      </w:pPr>
-      <w:r>
-        <w:rPr>
-          <w:rFonts w:ascii="Calibri" w:hAnsi="Calibri" w:cs="Calibri" w:eastAsia="Calibri"/>
-          <w:b/>
-          <w:color w:val="1F3B73"/>
-          <w:sz w:val="22"/>
-        </w:rPr>
-        <w:t>GridSearchCV</w:t>
-      </w:r>
-      <w:r>
-        <w:rPr>
-          <w:rFonts w:ascii="Calibri" w:hAnsi="Calibri" w:cs="Calibri" w:eastAsia="Calibri"/>
-          <w:color w:val="555555"/>
-          <w:sz w:val="22"/>
-        </w:rPr>
-        <w:t xml:space="preserve">  —  </w:t>
-      </w:r>
-      <w:r>
-        <w:rPr>
-          <w:rFonts w:ascii="Calibri" w:hAnsi="Calibri" w:cs="Calibri" w:eastAsia="Calibri"/>
-          <w:sz w:val="22"/>
-        </w:rPr>
-        <w:t>scikit-learn hyperparameter sweep. We use scoring='f1_macro', cv=StratifiedKFold(5), refit=False.</w:t>
-      </w:r>
-    </w:p>
-    <w:p>
-      <w:pPr>
-        <w:spacing w:after="80"/>
-      </w:pPr>
-      <w:r>
-        <w:rPr>
-          <w:rFonts w:ascii="Calibri" w:hAnsi="Calibri" w:cs="Calibri" w:eastAsia="Calibri"/>
-          <w:b/>
-          <w:color w:val="1F3B73"/>
-          <w:sz w:val="22"/>
-        </w:rPr>
-        <w:t>HistGradientBoosting / HistGradientBoostingClassifier</w:t>
-      </w:r>
-      <w:r>
-        <w:rPr>
-          <w:rFonts w:ascii="Calibri" w:hAnsi="Calibri" w:cs="Calibri" w:eastAsia="Calibri"/>
-          <w:color w:val="555555"/>
-          <w:sz w:val="22"/>
-        </w:rPr>
-        <w:t xml:space="preserve">  —  </w:t>
-      </w:r>
-      <w:r>
-        <w:rPr>
-          <w:rFonts w:ascii="Calibri" w:hAnsi="Calibri" w:cs="Calibri" w:eastAsia="Calibri"/>
-          <w:sz w:val="22"/>
-        </w:rPr>
-        <w:t>Histogram-binned gradient boosting. Fast on tabular data, robust to small samples.</w:t>
-      </w:r>
-    </w:p>
-    <w:p>
-      <w:pPr>
-        <w:spacing w:after="80"/>
-      </w:pPr>
-      <w:r>
-        <w:rPr>
-          <w:rFonts w:ascii="Calibri" w:hAnsi="Calibri" w:cs="Calibri" w:eastAsia="Calibri"/>
-          <w:b/>
-          <w:color w:val="1F3B73"/>
-          <w:sz w:val="22"/>
-        </w:rPr>
-        <w:t>imbalanced-learn (imblearn)</w:t>
-      </w:r>
-      <w:r>
-        <w:rPr>
-          <w:rFonts w:ascii="Calibri" w:hAnsi="Calibri" w:cs="Calibri" w:eastAsia="Calibri"/>
-          <w:color w:val="555555"/>
-          <w:sz w:val="22"/>
-        </w:rPr>
-        <w:t xml:space="preserve">  —  </w:t>
-      </w:r>
-      <w:r>
-        <w:rPr>
-          <w:rFonts w:ascii="Calibri" w:hAnsi="Calibri" w:cs="Calibri" w:eastAsia="Calibri"/>
-          <w:sz w:val="22"/>
-        </w:rPr>
-        <w:t>Library that ships SMOTE and the ImbPipeline wrapper allowing oversampling inside CV folds.</w:t>
-      </w:r>
-    </w:p>
-    <w:p>
-      <w:pPr>
-        <w:spacing w:after="80"/>
-      </w:pPr>
-      <w:r>
-        <w:rPr>
-          <w:rFonts w:ascii="Calibri" w:hAnsi="Calibri" w:cs="Calibri" w:eastAsia="Calibri"/>
-          <w:b/>
-          <w:color w:val="1F3B73"/>
-          <w:sz w:val="22"/>
-        </w:rPr>
-        <w:t>Interaction feature</w:t>
-      </w:r>
-      <w:r>
-        <w:rPr>
-          <w:rFonts w:ascii="Calibri" w:hAnsi="Calibri" w:cs="Calibri" w:eastAsia="Calibri"/>
-          <w:color w:val="555555"/>
-          <w:sz w:val="22"/>
-        </w:rPr>
-        <w:t xml:space="preserve">  —  </w:t>
-      </w:r>
-      <w:r>
-        <w:rPr>
-          <w:rFonts w:ascii="Calibri" w:hAnsi="Calibri" w:cs="Calibri" w:eastAsia="Calibri"/>
-          <w:sz w:val="22"/>
-        </w:rPr>
-        <w:t>Engineered feature = product of two base features. We use workload_x_fatigue, workload_x_age, force_x_age, fatigue_x_jobdur, deliv_x_days.</w:t>
-      </w:r>
-    </w:p>
-    <w:p>
-      <w:pPr>
-        <w:spacing w:after="80"/>
-      </w:pPr>
-      <w:r>
-        <w:rPr>
-          <w:rFonts w:ascii="Calibri" w:hAnsi="Calibri" w:cs="Calibri" w:eastAsia="Calibri"/>
-          <w:b/>
-          <w:color w:val="1F3B73"/>
-          <w:sz w:val="22"/>
-        </w:rPr>
-        <w:t>Jupyter notebook</w:t>
-      </w:r>
-      <w:r>
-        <w:rPr>
-          <w:rFonts w:ascii="Calibri" w:hAnsi="Calibri" w:cs="Calibri" w:eastAsia="Calibri"/>
-          <w:color w:val="555555"/>
-          <w:sz w:val="22"/>
-        </w:rPr>
-        <w:t xml:space="preserve">  —  </w:t>
-      </w:r>
-      <w:r>
-        <w:rPr>
-          <w:rFonts w:ascii="Calibri" w:hAnsi="Calibri" w:cs="Calibri" w:eastAsia="Calibri"/>
-          <w:sz w:val="22"/>
-        </w:rPr>
-        <w:t>Document combining executable Python cells, markdown, and rendered output. .ipynb extension.</w:t>
-      </w:r>
-    </w:p>
-    <w:p>
-      <w:pPr>
-        <w:spacing w:after="80"/>
-      </w:pPr>
-      <w:r>
-        <w:rPr>
-          <w:rFonts w:ascii="Calibri" w:hAnsi="Calibri" w:cs="Calibri" w:eastAsia="Calibri"/>
-          <w:b/>
-          <w:color w:val="1F3B73"/>
-          <w:sz w:val="22"/>
-        </w:rPr>
-        <w:t>Leakage</w:t>
-      </w:r>
-      <w:r>
-        <w:rPr>
-          <w:rFonts w:ascii="Calibri" w:hAnsi="Calibri" w:cs="Calibri" w:eastAsia="Calibri"/>
-          <w:color w:val="555555"/>
-          <w:sz w:val="22"/>
-        </w:rPr>
-        <w:t xml:space="preserve">  —  </w:t>
-      </w:r>
-      <w:r>
-        <w:rPr>
-          <w:rFonts w:ascii="Calibri" w:hAnsi="Calibri" w:cs="Calibri" w:eastAsia="Calibri"/>
-          <w:sz w:val="22"/>
-        </w:rPr>
-        <w:t>Model accidentally sees the target in its input. Symptom: implausibly high CV accuracy. Two leakage paths were identified and fixed in this project (Duration via vibration_index, Repetition via qcut boundary).</w:t>
-      </w:r>
-    </w:p>
-    <w:p>
-      <w:pPr>
-        <w:spacing w:after="80"/>
-      </w:pPr>
-      <w:r>
-        <w:rPr>
-          <w:rFonts w:ascii="Calibri" w:hAnsi="Calibri" w:cs="Calibri" w:eastAsia="Calibri"/>
-          <w:b/>
-          <w:color w:val="1F3B73"/>
-          <w:sz w:val="22"/>
-        </w:rPr>
-        <w:t>LogisticRegression</w:t>
-      </w:r>
-      <w:r>
-        <w:rPr>
-          <w:rFonts w:ascii="Calibri" w:hAnsi="Calibri" w:cs="Calibri" w:eastAsia="Calibri"/>
-          <w:color w:val="555555"/>
-          <w:sz w:val="22"/>
-        </w:rPr>
-        <w:t xml:space="preserve">  —  </w:t>
-      </w:r>
-      <w:r>
-        <w:rPr>
-          <w:rFonts w:ascii="Calibri" w:hAnsi="Calibri" w:cs="Calibri" w:eastAsia="Calibri"/>
-          <w:sz w:val="22"/>
-        </w:rPr>
-        <w:t>Linear model fitting log-odds of class membership. We use class_weight='balanced', max_iter=2000.</w:t>
-      </w:r>
-    </w:p>
-    <w:p>
-      <w:pPr>
-        <w:spacing w:after="80"/>
-      </w:pPr>
-      <w:r>
-        <w:rPr>
-          <w:rFonts w:ascii="Calibri" w:hAnsi="Calibri" w:cs="Calibri" w:eastAsia="Calibri"/>
-          <w:b/>
-          <w:color w:val="1F3B73"/>
-          <w:sz w:val="22"/>
-        </w:rPr>
-        <w:t>Macro AUC</w:t>
-      </w:r>
-      <w:r>
-        <w:rPr>
-          <w:rFonts w:ascii="Calibri" w:hAnsi="Calibri" w:cs="Calibri" w:eastAsia="Calibri"/>
-          <w:color w:val="555555"/>
-          <w:sz w:val="22"/>
-        </w:rPr>
-        <w:t xml:space="preserve">  —  </w:t>
-      </w:r>
-      <w:r>
-        <w:rPr>
-          <w:rFonts w:ascii="Calibri" w:hAnsi="Calibri" w:cs="Calibri" w:eastAsia="Calibri"/>
-          <w:sz w:val="22"/>
-        </w:rPr>
-        <w:t>Class-balanced average of one-vs-rest ROC-AUC. Reported in phase7_summary.csv.</w:t>
-      </w:r>
-    </w:p>
-    <w:p>
-      <w:pPr>
-        <w:spacing w:after="80"/>
-      </w:pPr>
-      <w:r>
-        <w:rPr>
-          <w:rFonts w:ascii="Calibri" w:hAnsi="Calibri" w:cs="Calibri" w:eastAsia="Calibri"/>
-          <w:b/>
-          <w:color w:val="1F3B73"/>
-          <w:sz w:val="22"/>
-        </w:rPr>
-        <w:t>MSD</w:t>
-      </w:r>
-      <w:r>
-        <w:rPr>
-          <w:rFonts w:ascii="Calibri" w:hAnsi="Calibri" w:cs="Calibri" w:eastAsia="Calibri"/>
-          <w:color w:val="555555"/>
-          <w:sz w:val="22"/>
-        </w:rPr>
-        <w:t xml:space="preserve">  —  </w:t>
-      </w:r>
-      <w:r>
-        <w:rPr>
-          <w:rFonts w:ascii="Calibri" w:hAnsi="Calibri" w:cs="Calibri" w:eastAsia="Calibri"/>
-          <w:sz w:val="22"/>
-        </w:rPr>
-        <w:t>Musculoskeletal Disorder. Soft-tissue, joint, nerve injuries.</w:t>
-      </w:r>
-    </w:p>
-    <w:p>
-      <w:pPr>
-        <w:spacing w:after="80"/>
-      </w:pPr>
-      <w:r>
-        <w:rPr>
-          <w:rFonts w:ascii="Calibri" w:hAnsi="Calibri" w:cs="Calibri" w:eastAsia="Calibri"/>
-          <w:b/>
-          <w:color w:val="1F3B73"/>
-          <w:sz w:val="22"/>
-        </w:rPr>
-        <w:t>NASA-TLX</w:t>
-      </w:r>
-      <w:r>
-        <w:rPr>
-          <w:rFonts w:ascii="Calibri" w:hAnsi="Calibri" w:cs="Calibri" w:eastAsia="Calibri"/>
-          <w:color w:val="555555"/>
-          <w:sz w:val="22"/>
-        </w:rPr>
-        <w:t xml:space="preserve">  —  </w:t>
-      </w:r>
-      <w:r>
-        <w:rPr>
-          <w:rFonts w:ascii="Calibri" w:hAnsi="Calibri" w:cs="Calibri" w:eastAsia="Calibri"/>
-          <w:sz w:val="22"/>
-        </w:rPr>
-        <w:t>NASA Task Load Index. Six 0–100 sub-scales (mental, physical, temporal, performance, effort, frustration). The performance item is reversed before averaging into workload_score.</w:t>
-      </w:r>
-    </w:p>
-    <w:p>
-      <w:pPr>
-        <w:spacing w:after="80"/>
-      </w:pPr>
-      <w:r>
-        <w:rPr>
-          <w:rFonts w:ascii="Calibri" w:hAnsi="Calibri" w:cs="Calibri" w:eastAsia="Calibri"/>
-          <w:b/>
-          <w:color w:val="1F3B73"/>
-          <w:sz w:val="22"/>
-        </w:rPr>
-        <w:t>NMQ</w:t>
-      </w:r>
-      <w:r>
-        <w:rPr>
-          <w:rFonts w:ascii="Calibri" w:hAnsi="Calibri" w:cs="Calibri" w:eastAsia="Calibri"/>
-          <w:color w:val="555555"/>
-          <w:sz w:val="22"/>
-        </w:rPr>
-        <w:t xml:space="preserve">  —  </w:t>
-      </w:r>
-      <w:r>
-        <w:rPr>
-          <w:rFonts w:ascii="Calibri" w:hAnsi="Calibri" w:cs="Calibri" w:eastAsia="Calibri"/>
-          <w:sz w:val="22"/>
-        </w:rPr>
-        <w:t>Nordic Musculoskeletal Questionnaire. 9-area 12-month pain self-report plus 4-area 7-day discomfort.</w:t>
-      </w:r>
-    </w:p>
-    <w:p>
-      <w:pPr>
-        <w:spacing w:after="80"/>
-      </w:pPr>
-      <w:r>
-        <w:rPr>
-          <w:rFonts w:ascii="Calibri" w:hAnsi="Calibri" w:cs="Calibri" w:eastAsia="Calibri"/>
-          <w:b/>
-          <w:color w:val="1F3B73"/>
-          <w:sz w:val="22"/>
-        </w:rPr>
-        <w:t>Odds ratio (OR)</w:t>
-      </w:r>
-      <w:r>
-        <w:rPr>
-          <w:rFonts w:ascii="Calibri" w:hAnsi="Calibri" w:cs="Calibri" w:eastAsia="Calibri"/>
-          <w:color w:val="555555"/>
-          <w:sz w:val="22"/>
-        </w:rPr>
-        <w:t xml:space="preserve">  —  </w:t>
-      </w:r>
-      <w:r>
-        <w:rPr>
-          <w:rFonts w:ascii="Calibri" w:hAnsi="Calibri" w:cs="Calibri" w:eastAsia="Calibri"/>
-          <w:sz w:val="22"/>
-        </w:rPr>
-        <w:t>Multiplicative effect on the odds of the outcome per one-unit increase in the predictor. Reported with 95% CI.</w:t>
-      </w:r>
-    </w:p>
-    <w:p>
-      <w:pPr>
-        <w:spacing w:after="80"/>
-      </w:pPr>
-      <w:r>
-        <w:rPr>
-          <w:rFonts w:ascii="Calibri" w:hAnsi="Calibri" w:cs="Calibri" w:eastAsia="Calibri"/>
-          <w:b/>
-          <w:color w:val="1F3B73"/>
-          <w:sz w:val="22"/>
-        </w:rPr>
-        <w:t>Overfit gap</w:t>
-      </w:r>
-      <w:r>
-        <w:rPr>
-          <w:rFonts w:ascii="Calibri" w:hAnsi="Calibri" w:cs="Calibri" w:eastAsia="Calibri"/>
-          <w:color w:val="555555"/>
-          <w:sz w:val="22"/>
-        </w:rPr>
-        <w:t xml:space="preserve">  —  </w:t>
-      </w:r>
-      <w:r>
-        <w:rPr>
-          <w:rFonts w:ascii="Calibri" w:hAnsi="Calibri" w:cs="Calibri" w:eastAsia="Calibri"/>
-          <w:sz w:val="22"/>
-        </w:rPr>
-        <w:t>train_accuracy − test_accuracy in CV. &gt; 0.15 flags concern.</w:t>
-      </w:r>
-    </w:p>
-    <w:p>
-      <w:pPr>
-        <w:spacing w:after="80"/>
-      </w:pPr>
-      <w:r>
-        <w:rPr>
-          <w:rFonts w:ascii="Calibri" w:hAnsi="Calibri" w:cs="Calibri" w:eastAsia="Calibri"/>
-          <w:b/>
-          <w:color w:val="1F3B73"/>
-          <w:sz w:val="22"/>
-        </w:rPr>
-        <w:t>p-value</w:t>
-      </w:r>
-      <w:r>
-        <w:rPr>
-          <w:rFonts w:ascii="Calibri" w:hAnsi="Calibri" w:cs="Calibri" w:eastAsia="Calibri"/>
-          <w:color w:val="555555"/>
-          <w:sz w:val="22"/>
-        </w:rPr>
-        <w:t xml:space="preserve">  —  </w:t>
-      </w:r>
-      <w:r>
-        <w:rPr>
-          <w:rFonts w:ascii="Calibri" w:hAnsi="Calibri" w:cs="Calibri" w:eastAsia="Calibri"/>
-          <w:sz w:val="22"/>
-        </w:rPr>
-        <w:t>Probability of observing the data (or more extreme) under the null. We use p &lt; 0.05 as significant.</w:t>
-      </w:r>
-    </w:p>
-    <w:p>
-      <w:pPr>
-        <w:spacing w:after="80"/>
-      </w:pPr>
-      <w:r>
-        <w:rPr>
-          <w:rFonts w:ascii="Calibri" w:hAnsi="Calibri" w:cs="Calibri" w:eastAsia="Calibri"/>
-          <w:b/>
-          <w:color w:val="1F3B73"/>
-          <w:sz w:val="22"/>
-        </w:rPr>
-        <w:t>Pipeline (sklearn / imblearn)</w:t>
-      </w:r>
-      <w:r>
-        <w:rPr>
-          <w:rFonts w:ascii="Calibri" w:hAnsi="Calibri" w:cs="Calibri" w:eastAsia="Calibri"/>
-          <w:color w:val="555555"/>
-          <w:sz w:val="22"/>
-        </w:rPr>
-        <w:t xml:space="preserve">  —  </w:t>
-      </w:r>
-      <w:r>
-        <w:rPr>
-          <w:rFonts w:ascii="Calibri" w:hAnsi="Calibri" w:cs="Calibri" w:eastAsia="Calibri"/>
-          <w:sz w:val="22"/>
-        </w:rPr>
-        <w:t>Sequential composition of transformers + a final estimator. Our pipeline is [('smote', SMOTE), ('clf', model)].</w:t>
-      </w:r>
-    </w:p>
-    <w:p>
-      <w:pPr>
-        <w:spacing w:after="80"/>
-      </w:pPr>
-      <w:r>
-        <w:rPr>
-          <w:rFonts w:ascii="Calibri" w:hAnsi="Calibri" w:cs="Calibri" w:eastAsia="Calibri"/>
-          <w:b/>
-          <w:color w:val="1F3B73"/>
-          <w:sz w:val="22"/>
-        </w:rPr>
-        <w:t>QEC</w:t>
-      </w:r>
-      <w:r>
-        <w:rPr>
-          <w:rFonts w:ascii="Calibri" w:hAnsi="Calibri" w:cs="Calibri" w:eastAsia="Calibri"/>
-          <w:color w:val="555555"/>
-          <w:sz w:val="22"/>
-        </w:rPr>
-        <w:t xml:space="preserve">  —  </w:t>
-      </w:r>
-      <w:r>
-        <w:rPr>
-          <w:rFonts w:ascii="Calibri" w:hAnsi="Calibri" w:cs="Calibri" w:eastAsia="Calibri"/>
-          <w:sz w:val="22"/>
-        </w:rPr>
-        <w:t>Quick Exposure Check. Observer-scored composite of 8 body-region and exposure dimensions.</w:t>
-      </w:r>
-    </w:p>
-    <w:p>
-      <w:pPr>
-        <w:spacing w:after="80"/>
-      </w:pPr>
-      <w:r>
-        <w:rPr>
-          <w:rFonts w:ascii="Calibri" w:hAnsi="Calibri" w:cs="Calibri" w:eastAsia="Calibri"/>
-          <w:b/>
-          <w:color w:val="1F3B73"/>
-          <w:sz w:val="22"/>
-        </w:rPr>
-        <w:t>Random Forest</w:t>
-      </w:r>
-      <w:r>
-        <w:rPr>
-          <w:rFonts w:ascii="Calibri" w:hAnsi="Calibri" w:cs="Calibri" w:eastAsia="Calibri"/>
-          <w:color w:val="555555"/>
-          <w:sz w:val="22"/>
-        </w:rPr>
-        <w:t xml:space="preserve">  —  </w:t>
-      </w:r>
-      <w:r>
-        <w:rPr>
-          <w:rFonts w:ascii="Calibri" w:hAnsi="Calibri" w:cs="Calibri" w:eastAsia="Calibri"/>
-          <w:sz w:val="22"/>
-        </w:rPr>
-        <w:t>Bagging ensemble of decision trees with random feature subsetting.</w:t>
-      </w:r>
-    </w:p>
-    <w:p>
-      <w:pPr>
-        <w:spacing w:after="80"/>
-      </w:pPr>
-      <w:r>
-        <w:rPr>
-          <w:rFonts w:ascii="Calibri" w:hAnsi="Calibri" w:cs="Calibri" w:eastAsia="Calibri"/>
-          <w:b/>
-          <w:color w:val="1F3B73"/>
-          <w:sz w:val="22"/>
-        </w:rPr>
-        <w:t>Risk profile</w:t>
-      </w:r>
-      <w:r>
-        <w:rPr>
-          <w:rFonts w:ascii="Calibri" w:hAnsi="Calibri" w:cs="Calibri" w:eastAsia="Calibri"/>
-          <w:color w:val="555555"/>
-          <w:sz w:val="22"/>
-        </w:rPr>
-        <w:t xml:space="preserve">  —  </w:t>
-      </w:r>
-      <w:r>
-        <w:rPr>
-          <w:rFonts w:ascii="Calibri" w:hAnsi="Calibri" w:cs="Calibri" w:eastAsia="Calibri"/>
-          <w:sz w:val="22"/>
-        </w:rPr>
-        <w:t>Per-rider 6-tuple of Low/Medium/High labels across the 6 risk factors. Stored in data/processed/risk_profile.csv.</w:t>
-      </w:r>
-    </w:p>
-    <w:p>
-      <w:pPr>
-        <w:spacing w:after="80"/>
-      </w:pPr>
-      <w:r>
-        <w:rPr>
-          <w:rFonts w:ascii="Calibri" w:hAnsi="Calibri" w:cs="Calibri" w:eastAsia="Calibri"/>
-          <w:b/>
-          <w:color w:val="1F3B73"/>
-          <w:sz w:val="22"/>
-        </w:rPr>
-        <w:t>ROC curve</w:t>
-      </w:r>
-      <w:r>
-        <w:rPr>
-          <w:rFonts w:ascii="Calibri" w:hAnsi="Calibri" w:cs="Calibri" w:eastAsia="Calibri"/>
-          <w:color w:val="555555"/>
-          <w:sz w:val="22"/>
-        </w:rPr>
-        <w:t xml:space="preserve">  —  </w:t>
-      </w:r>
-      <w:r>
-        <w:rPr>
-          <w:rFonts w:ascii="Calibri" w:hAnsi="Calibri" w:cs="Calibri" w:eastAsia="Calibri"/>
-          <w:sz w:val="22"/>
-        </w:rPr>
-        <w:t>Receiver Operating Characteristic. Plots true positive rate vs. false positive rate across decision thresholds.</w:t>
-      </w:r>
-    </w:p>
-    <w:p>
-      <w:pPr>
-        <w:spacing w:after="80"/>
-      </w:pPr>
-      <w:r>
-        <w:rPr>
-          <w:rFonts w:ascii="Calibri" w:hAnsi="Calibri" w:cs="Calibri" w:eastAsia="Calibri"/>
-          <w:b/>
-          <w:color w:val="1F3B73"/>
-          <w:sz w:val="22"/>
-        </w:rPr>
-        <w:t>RULA</w:t>
-      </w:r>
-      <w:r>
-        <w:rPr>
-          <w:rFonts w:ascii="Calibri" w:hAnsi="Calibri" w:cs="Calibri" w:eastAsia="Calibri"/>
-          <w:color w:val="555555"/>
-          <w:sz w:val="22"/>
-        </w:rPr>
-        <w:t xml:space="preserve">  —  </w:t>
-      </w:r>
-      <w:r>
-        <w:rPr>
-          <w:rFonts w:ascii="Calibri" w:hAnsi="Calibri" w:cs="Calibri" w:eastAsia="Calibri"/>
-          <w:sz w:val="22"/>
-        </w:rPr>
-        <w:t>Rapid Upper Limb Assessment. Observer-scored across 11 components, combined via Tables A → B → C into an action-level score 1–7.</w:t>
-      </w:r>
-    </w:p>
-    <w:p>
-      <w:pPr>
-        <w:spacing w:after="80"/>
-      </w:pPr>
-      <w:r>
-        <w:rPr>
-          <w:rFonts w:ascii="Calibri" w:hAnsi="Calibri" w:cs="Calibri" w:eastAsia="Calibri"/>
-          <w:b/>
-          <w:color w:val="1F3B73"/>
-          <w:sz w:val="22"/>
-        </w:rPr>
-        <w:t>SMOTE</w:t>
-      </w:r>
-      <w:r>
-        <w:rPr>
-          <w:rFonts w:ascii="Calibri" w:hAnsi="Calibri" w:cs="Calibri" w:eastAsia="Calibri"/>
-          <w:color w:val="555555"/>
-          <w:sz w:val="22"/>
-        </w:rPr>
-        <w:t xml:space="preserve">  —  </w:t>
-      </w:r>
-      <w:r>
-        <w:rPr>
-          <w:rFonts w:ascii="Calibri" w:hAnsi="Calibri" w:cs="Calibri" w:eastAsia="Calibri"/>
-          <w:sz w:val="22"/>
-        </w:rPr>
-        <w:t>Synthetic Minority Over-sampling Technique. Creates synthetic minority-class examples in feature space to balance training folds.</w:t>
-      </w:r>
-    </w:p>
-    <w:p>
-      <w:pPr>
-        <w:spacing w:after="80"/>
-      </w:pPr>
-      <w:r>
-        <w:rPr>
-          <w:rFonts w:ascii="Calibri" w:hAnsi="Calibri" w:cs="Calibri" w:eastAsia="Calibri"/>
-          <w:b/>
-          <w:color w:val="1F3B73"/>
-          <w:sz w:val="22"/>
-        </w:rPr>
-        <w:t>Severity-rank merge</w:t>
-      </w:r>
-      <w:r>
-        <w:rPr>
-          <w:rFonts w:ascii="Calibri" w:hAnsi="Calibri" w:cs="Calibri" w:eastAsia="Calibri"/>
-          <w:color w:val="555555"/>
-          <w:sz w:val="22"/>
-        </w:rPr>
-        <w:t xml:space="preserve">  —  </w:t>
-      </w:r>
-      <w:r>
-        <w:rPr>
-          <w:rFonts w:ascii="Calibri" w:hAnsi="Calibri" w:cs="Calibri" w:eastAsia="Calibri"/>
-          <w:sz w:val="22"/>
-        </w:rPr>
-        <w:t>Phase 2 Step 8 procedure to pair survey rows with anonymous posture observations: rank survey rows by exposure-severity (NMQ count + fatigue + hours), rank observations by rula_table_c, merge rank-to-rank.</w:t>
-      </w:r>
-    </w:p>
-    <w:p>
-      <w:pPr>
-        <w:spacing w:after="80"/>
-      </w:pPr>
-      <w:r>
-        <w:rPr>
-          <w:rFonts w:ascii="Calibri" w:hAnsi="Calibri" w:cs="Calibri" w:eastAsia="Calibri"/>
-          <w:b/>
-          <w:color w:val="1F3B73"/>
-          <w:sz w:val="22"/>
-        </w:rPr>
-        <w:t>Stacking / StackingClassifier</w:t>
-      </w:r>
-      <w:r>
-        <w:rPr>
-          <w:rFonts w:ascii="Calibri" w:hAnsi="Calibri" w:cs="Calibri" w:eastAsia="Calibri"/>
-          <w:color w:val="555555"/>
-          <w:sz w:val="22"/>
-        </w:rPr>
-        <w:t xml:space="preserve">  —  </w:t>
-      </w:r>
-      <w:r>
-        <w:rPr>
-          <w:rFonts w:ascii="Calibri" w:hAnsi="Calibri" w:cs="Calibri" w:eastAsia="Calibri"/>
-          <w:sz w:val="22"/>
-        </w:rPr>
-        <w:t>Meta-ensemble that learns a final estimator on top of base learners. We stack RandomForest, ExtraTrees, XGBoost, HistGBM with a LogisticRegression meta-learner.</w:t>
-      </w:r>
-    </w:p>
-    <w:p>
-      <w:pPr>
-        <w:spacing w:after="80"/>
-      </w:pPr>
-      <w:r>
-        <w:rPr>
-          <w:rFonts w:ascii="Calibri" w:hAnsi="Calibri" w:cs="Calibri" w:eastAsia="Calibri"/>
-          <w:b/>
-          <w:color w:val="1F3B73"/>
-          <w:sz w:val="22"/>
-        </w:rPr>
-        <w:t>Stage 1</w:t>
-      </w:r>
-      <w:r>
-        <w:rPr>
-          <w:rFonts w:ascii="Calibri" w:hAnsi="Calibri" w:cs="Calibri" w:eastAsia="Calibri"/>
-          <w:color w:val="555555"/>
-          <w:sz w:val="22"/>
-        </w:rPr>
-        <w:t xml:space="preserve">  —  </w:t>
-      </w:r>
-      <w:r>
-        <w:rPr>
-          <w:rFonts w:ascii="Calibri" w:hAnsi="Calibri" w:cs="Calibri" w:eastAsia="Calibri"/>
-          <w:sz w:val="22"/>
-        </w:rPr>
-        <w:t>Deterministic risk-factor labelling using standard ergonomic thresholds (Phase 3).</w:t>
-      </w:r>
-    </w:p>
-    <w:p>
-      <w:pPr>
-        <w:spacing w:after="80"/>
-      </w:pPr>
-      <w:r>
-        <w:rPr>
-          <w:rFonts w:ascii="Calibri" w:hAnsi="Calibri" w:cs="Calibri" w:eastAsia="Calibri"/>
-          <w:b/>
-          <w:color w:val="1F3B73"/>
-          <w:sz w:val="22"/>
-        </w:rPr>
-        <w:t>Stage 2</w:t>
-      </w:r>
-      <w:r>
-        <w:rPr>
-          <w:rFonts w:ascii="Calibri" w:hAnsi="Calibri" w:cs="Calibri" w:eastAsia="Calibri"/>
-          <w:color w:val="555555"/>
-          <w:sz w:val="22"/>
-        </w:rPr>
-        <w:t xml:space="preserve">  —  </w:t>
-      </w:r>
-      <w:r>
-        <w:rPr>
-          <w:rFonts w:ascii="Calibri" w:hAnsi="Calibri" w:cs="Calibri" w:eastAsia="Calibri"/>
-          <w:sz w:val="22"/>
-        </w:rPr>
-        <w:t>Supervised ML that learns the Stage-1 labels from rider features (Phases 6 &amp; 7).</w:t>
-      </w:r>
-    </w:p>
-    <w:p>
-      <w:pPr>
-        <w:spacing w:after="80"/>
-      </w:pPr>
-      <w:r>
-        <w:rPr>
-          <w:rFonts w:ascii="Calibri" w:hAnsi="Calibri" w:cs="Calibri" w:eastAsia="Calibri"/>
-          <w:b/>
-          <w:color w:val="1F3B73"/>
-          <w:sz w:val="22"/>
-        </w:rPr>
-        <w:t>StratifiedKFold</w:t>
-      </w:r>
-      <w:r>
-        <w:rPr>
-          <w:rFonts w:ascii="Calibri" w:hAnsi="Calibri" w:cs="Calibri" w:eastAsia="Calibri"/>
-          <w:color w:val="555555"/>
-          <w:sz w:val="22"/>
-        </w:rPr>
-        <w:t xml:space="preserve">  —  </w:t>
-      </w:r>
-      <w:r>
-        <w:rPr>
-          <w:rFonts w:ascii="Calibri" w:hAnsi="Calibri" w:cs="Calibri" w:eastAsia="Calibri"/>
-          <w:sz w:val="22"/>
-        </w:rPr>
-        <w:t>Cross-validation split that preserves class proportions per fold. RNG = 42 throughout.</w:t>
-      </w:r>
-    </w:p>
-    <w:p>
-      <w:pPr>
-        <w:spacing w:after="80"/>
-      </w:pPr>
-      <w:r>
-        <w:rPr>
-          <w:rFonts w:ascii="Calibri" w:hAnsi="Calibri" w:cs="Calibri" w:eastAsia="Calibri"/>
-          <w:b/>
-          <w:color w:val="1F3B73"/>
-          <w:sz w:val="22"/>
-        </w:rPr>
-        <w:t>Tercile</w:t>
-      </w:r>
-      <w:r>
-        <w:rPr>
-          <w:rFonts w:ascii="Calibri" w:hAnsi="Calibri" w:cs="Calibri" w:eastAsia="Calibri"/>
-          <w:color w:val="555555"/>
-          <w:sz w:val="22"/>
-        </w:rPr>
-        <w:t xml:space="preserve">  —  </w:t>
-      </w:r>
-      <w:r>
-        <w:rPr>
-          <w:rFonts w:ascii="Calibri" w:hAnsi="Calibri" w:cs="Calibri" w:eastAsia="Calibri"/>
-          <w:sz w:val="22"/>
-        </w:rPr>
-        <w:t>Empirical 33.3 / 66.7 percentile cut. Used by pd.qcut(q=3). The Repetition qcut boundary fault that motivated the Phase 3 fix sits at the 66.7th percentile of deliveries_per_hour = 3.889.</w:t>
-      </w:r>
-    </w:p>
-    <w:p>
-      <w:pPr>
-        <w:spacing w:after="80"/>
-      </w:pPr>
-      <w:r>
-        <w:rPr>
-          <w:rFonts w:ascii="Calibri" w:hAnsi="Calibri" w:cs="Calibri" w:eastAsia="Calibri"/>
-          <w:b/>
-          <w:color w:val="1F3B73"/>
-          <w:sz w:val="22"/>
-        </w:rPr>
-        <w:t>XGBoost / XGBClassifier</w:t>
-      </w:r>
-      <w:r>
-        <w:rPr>
-          <w:rFonts w:ascii="Calibri" w:hAnsi="Calibri" w:cs="Calibri" w:eastAsia="Calibri"/>
-          <w:color w:val="555555"/>
-          <w:sz w:val="22"/>
-        </w:rPr>
-        <w:t xml:space="preserve">  —  </w:t>
-      </w:r>
-      <w:r>
-        <w:rPr>
-          <w:rFonts w:ascii="Calibri" w:hAnsi="Calibri" w:cs="Calibri" w:eastAsia="Calibri"/>
-          <w:sz w:val="22"/>
-        </w:rPr>
-        <w:t>Gradient-boosted trees. We use eval_metric='mlogloss', tuned over n_estimators, max_depth, learning_rate.</w:t>
-      </w:r>
-    </w:p>
-    <w:p>
-      <w:pPr>
-        <w:spacing w:after="80"/>
-      </w:pPr>
-      <w:r>
-        <w:rPr>
-          <w:rFonts w:ascii="Calibri" w:hAnsi="Calibri" w:cs="Calibri" w:eastAsia="Calibri"/>
-          <w:b/>
-          <w:color w:val="1F3B73"/>
-          <w:sz w:val="22"/>
-        </w:rPr>
-        <w:t>workload_score</w:t>
-      </w:r>
-      <w:r>
-        <w:rPr>
-          <w:rFonts w:ascii="Calibri" w:hAnsi="Calibri" w:cs="Calibri" w:eastAsia="Calibri"/>
-          <w:color w:val="555555"/>
-          <w:sz w:val="22"/>
-        </w:rPr>
-        <w:t xml:space="preserve">  —  </w:t>
-      </w:r>
-      <w:r>
-        <w:rPr>
-          <w:rFonts w:ascii="Calibri" w:hAnsi="Calibri" w:cs="Calibri" w:eastAsia="Calibri"/>
-          <w:sz w:val="22"/>
-        </w:rPr>
-        <w:t>Mean of the 6 NASA-TLX items, with the performance / dissatisfaction item already in load direction (0 = no load, 100 = maximum load).</w:t>
-      </w:r>
-    </w:p>
-    <w:p>
-      <w:pPr>
-        <w:spacing w:after="80"/>
-      </w:pPr>
-      <w:r>
-        <w:rPr>
-          <w:rFonts w:ascii="Calibri" w:hAnsi="Calibri" w:cs="Calibri" w:eastAsia="Calibri"/>
-          <w:b/>
-          <w:color w:val="1F3B73"/>
-          <w:sz w:val="22"/>
-        </w:rPr>
-        <w:t>fatigue_score</w:t>
-      </w:r>
-      <w:r>
-        <w:rPr>
-          <w:rFonts w:ascii="Calibri" w:hAnsi="Calibri" w:cs="Calibri" w:eastAsia="Calibri"/>
-          <w:color w:val="555555"/>
-          <w:sz w:val="22"/>
-        </w:rPr>
-        <w:t xml:space="preserve">  —  </w:t>
-      </w:r>
-      <w:r>
-        <w:rPr>
-          <w:rFonts w:ascii="Calibri" w:hAnsi="Calibri" w:cs="Calibri" w:eastAsia="Calibri"/>
-          <w:sz w:val="22"/>
-        </w:rPr>
-        <w:t>Mean of the 6 Borg CR10 items.</w:t>
-      </w:r>
-    </w:p>
-    <w:p>
-      <w:pPr>
-        <w:keepNext/>
-        <w:spacing w:before="360" w:after="120"/>
-      </w:pPr>
-      <w:r>
-        <w:rPr>
-          <w:rFonts w:ascii="Calibri" w:hAnsi="Calibri" w:cs="Calibri" w:eastAsia="Calibri"/>
-          <w:b/>
-          <w:color w:val="1F3B73"/>
-          <w:sz w:val="36"/>
-        </w:rPr>
-        <w:t>12. Repository layout</w:t>
-      </w:r>
-    </w:p>
-    <w:p>
-      <w:pPr>
-        <w:spacing w:before="80" w:after="160"/>
+        <w:spacing w:before="40" w:after="160"/>
         <w:ind w:left="340"/>
       </w:pPr>
       <w:r>
@@ -4631,72 +2389,45 @@
         </w:rPr>
         <w:t>Ergonomic_Project/</w:t>
         <w:br/>
-        <w:t>├── README.md</w:t>
+        <w:t xml:space="preserve">  README.md</w:t>
         <w:br/>
-        <w:t>├── docs/</w:t>
+        <w:t xml:space="preserve">  docs/</w:t>
         <w:br/>
-        <w:t>│   ├── PROJECT_EXPLAINED.md / .docx   &lt;- this guide</w:t>
+        <w:t xml:space="preserve">    PROJECT_EXPLAINED.md / .docx   this write-up</w:t>
         <w:br/>
-        <w:t>│   ├── results.md                     &lt;- mentor write-up</w:t>
+        <w:t xml:space="preserve">    results.md                     numbers and tables for the mentor</w:t>
         <w:br/>
-        <w:t>│   └── development_plan.md</w:t>
+        <w:t xml:space="preserve">    development_plan.md            original execution plan</w:t>
         <w:br/>
-        <w:t>├── data/</w:t>
+        <w:t xml:space="preserve">  data/</w:t>
         <w:br/>
-        <w:t>│   ├── raw/                           &lt;- delivery_rider_survey.csv, posture_data.xlsx</w:t>
+        <w:t xml:space="preserve">    raw/                           delivery_rider_survey.csv, posture_data.xlsx</w:t>
         <w:br/>
-        <w:t>│   ├── processed/                     &lt;- cleaned.csv, model_ready.csv, risk_profile.csv</w:t>
+        <w:t xml:space="preserve">    processed/                     cleaned.csv, model_ready.csv, risk_profile.csv</w:t>
         <w:br/>
-        <w:t>│   └── example_rider.json</w:t>
+        <w:t xml:space="preserve">    example_rider.json</w:t>
         <w:br/>
-        <w:t>├── notebooks/                         &lt;- 01..07 (the 7 phases)</w:t>
+        <w:t xml:space="preserve">  notebooks/                       01..07 (the seven phases)</w:t>
         <w:br/>
-        <w:t>├── src/</w:t>
+        <w:t xml:space="preserve">  src/</w:t>
         <w:br/>
-        <w:t>│   ├── predict.py</w:t>
+        <w:t xml:space="preserve">    predict.py                     command-line predictor</w:t>
         <w:br/>
-        <w:t>│   ├── build_results_deck.py</w:t>
+        <w:t xml:space="preserve">    build_results_deck.py          builds the WITH_RESULTS PowerPoint</w:t>
         <w:br/>
-        <w:t>│   ├── build_project_doc.py           &lt;- builds this Word doc</w:t>
+        <w:t xml:space="preserve">    build_project_doc.py           builds this Word doc</w:t>
         <w:br/>
-        <w:t>│   └── finalize_deck.py</w:t>
+        <w:t xml:space="preserve">  app/streamlit_app.py             interactive demo</w:t>
         <w:br/>
-        <w:t>├── app/streamlit_app.py</w:t>
+        <w:t xml:space="preserve">  deck/                            Final.pptx and WITH_RESULTS.pptx</w:t>
         <w:br/>
-        <w:t>├── deck/</w:t>
+        <w:t xml:space="preserve">  outputs/</w:t>
         <w:br/>
-        <w:t>│   ├── ...Final.pptx</w:t>
+        <w:t xml:space="preserve">    figures/   all PNGs</w:t>
         <w:br/>
-        <w:t>│   └── ...WITH_RESULTS.pptx</w:t>
+        <w:t xml:space="preserve">    tables/    result CSVs</w:t>
         <w:br/>
-        <w:t>└── outputs/</w:t>
-        <w:br/>
-        <w:t xml:space="preserve">    ├── figures/   &lt;- all PNGs</w:t>
-        <w:br/>
-        <w:t xml:space="preserve">    ├── tables/    &lt;- all CSV result tables</w:t>
-        <w:br/>
-        <w:t xml:space="preserve">    └── models/    &lt;- 6 joblib bundles</w:t>
-      </w:r>
-    </w:p>
-    <w:p>
-      <w:pPr>
-        <w:spacing w:after="120" w:before="0"/>
-      </w:pPr>
-    </w:p>
-    <w:p>
-      <w:pPr>
-        <w:spacing w:after="120" w:before="0"/>
-        <w:jc w:val="center"/>
-      </w:pPr>
-      <w:r>
-        <w:rPr>
-          <w:rFonts w:ascii="Calibri" w:hAnsi="Calibri" w:cs="Calibri" w:eastAsia="Calibri"/>
-          <w:b w:val="0"/>
-          <w:i/>
-          <w:color w:val="555555"/>
-          <w:sz w:val="22"/>
-        </w:rPr>
-        <w:t>End of document.</w:t>
+        <w:t xml:space="preserve">    models/    the six saved joblib bundles</w:t>
       </w:r>
     </w:p>
     <w:sectPr>

</xml_diff>